<commit_message>
docs(lanzamiento): pack inversor tools and Pack Aliado refresh
Add inversor inventory/verify/zip tooling, expand Gabriel Barrios pack materials, and retire obsolete modelo financiero generators under Lanzamiento/_tools.

Co-authored-by: Cursor <cursoragent@cursor.com>
</commit_message>
<xml_diff>
--- a/docs/Pack_Aliado_Gabriel_Barrios/docx/02_Brief_Una_Pagina.docx
+++ b/docs/Pack_Aliado_Gabriel_Barrios/docx/02_Brief_Una_Pagina.docx
@@ -47,7 +47,7 @@
         <w:t>Qué es este documento:</w:t>
       </w:r>
       <w:r>
-        <w:t xml:space="preserve"> brief de una página ampliado con la tesis de negocio, números clave y plan operativo — para que evalúes la propuesta con contexto suficiente sin leer el pack completo.  </w:t>
+        <w:t xml:space="preserve"> brief ampliado con la tesis de negocio, números clave y plan operativo — para evaluar la propuesta con contexto suficiente sin leer el pack completo.  </w:t>
       </w:r>
     </w:p>
     <w:p>
@@ -86,7 +86,7 @@
         <w:t>Zonix Pharma</w:t>
       </w:r>
       <w:r>
-        <w:t xml:space="preserve"> = marketplace farmacéutico B2B2C en Venezuela (paciente → farmacia independiente → farmacéutico colegiado → partner logístico).</w:t>
+        <w:t xml:space="preserve"> = marketplace farmacéutico en Venezuela (paciente → farmacia independiente → farmacéutico colegiado → partner logístico).</w:t>
       </w:r>
     </w:p>
     <w:p>
@@ -155,7 +155,7 @@
         <w:t>Producto:</w:t>
       </w:r>
       <w:r>
-        <w:t xml:space="preserve"> ~4 años de desarrollo; staging operativo con </w:t>
+        <w:t xml:space="preserve"> ~4 años de desarrollo; entorno de prueba con </w:t>
       </w:r>
       <w:r>
         <w:rPr>
@@ -196,7 +196,7 @@
         <w:t>25/40/55 USD</w:t>
       </w:r>
       <w:r>
-        <w:t xml:space="preserve"> + % moderado sobre GMV — muy por debajo de agregadores.</w:t>
+        <w:t xml:space="preserve"> + % moderado sobre ventas en app — muy por debajo de agregadores.</w:t>
       </w:r>
     </w:p>
     <w:p>
@@ -271,16 +271,16 @@
         <w:t>Zonix Pharma</w:t>
       </w:r>
       <w:r>
-        <w:t xml:space="preserve"> es un marketplace farmacéutico </w:t>
+        <w:t xml:space="preserve"> conecta en una sola app al </w:t>
       </w:r>
       <w:r>
         <w:rPr>
           <w:b/>
         </w:rPr>
-        <w:t>B2B2C</w:t>
+        <w:t>paciente</w:t>
       </w:r>
       <w:r>
-        <w:t xml:space="preserve"> en Venezuela: el paciente compra en app; la </w:t>
+        <w:t xml:space="preserve">, la </w:t>
       </w:r>
       <w:r>
         <w:rPr>
@@ -289,7 +289,7 @@
         <w:t>farmacia independiente o mediana</w:t>
       </w:r>
       <w:r>
-        <w:t xml:space="preserve"> despacha; un </w:t>
+        <w:t xml:space="preserve">, el </w:t>
       </w:r>
       <w:r>
         <w:rPr>
@@ -298,34 +298,25 @@
         <w:t>farmacéutico colegiado de esa farmacia</w:t>
       </w:r>
       <w:r>
-        <w:t xml:space="preserve"> valida recetas cuando aplica; la </w:t>
+        <w:t xml:space="preserve"> y una </w:t>
       </w:r>
       <w:r>
         <w:rPr>
           <w:b/>
         </w:rPr>
-        <w:t>última milla</w:t>
+        <w:t>empresa de delivery</w:t>
       </w:r>
       <w:r>
-        <w:t xml:space="preserve"> la hace un </w:t>
+        <w:t xml:space="preserve"> que ejecuta la última milla. Zonix </w:t>
       </w:r>
       <w:r>
         <w:rPr>
           <w:b/>
         </w:rPr>
-        <w:t>partner logístico</w:t>
+        <w:t>no</w:t>
       </w:r>
       <w:r>
-        <w:t xml:space="preserve"> bajo contrato marco — </w:t>
-      </w:r>
-      <w:r>
-        <w:rPr>
-          <w:b/>
-        </w:rPr>
-        <w:t>sin flota propia</w:t>
-      </w:r>
-      <w:r>
-        <w:t xml:space="preserve"> de Zonix.</w:t>
+        <w:t xml:space="preserve"> compra medicamentos ni opera motos propias.</w:t>
       </w:r>
     </w:p>
     <w:p>
@@ -343,7 +334,7 @@
         <w:rPr>
           <w:b/>
         </w:rPr>
-        <w:t>fee bajo + Rx validado</w:t>
+        <w:t>costo bajo + receta validada</w:t>
       </w:r>
       <w:r>
         <w:t xml:space="preserve">, en un mercado pharma </w:t>
@@ -367,7 +358,7 @@
         <w:t>Estado producto:</w:t>
       </w:r>
       <w:r>
-        <w:t xml:space="preserve"> vertical farmacia sobre stack de ~4 años; capa Pharma (Rx, roles farmacéuticos) ya invertida. Hoy: staging operativo, </w:t>
+        <w:t xml:space="preserve"> vertical farmacia sobre plataforma de ~4 años; capa de receta y roles farmacéuticos ya invertida. Hoy: entorno de prueba operativo, </w:t>
       </w:r>
       <w:r>
         <w:rPr>
@@ -411,7 +402,30 @@
         <w:pStyle w:val="Heading2"/>
       </w:pPr>
       <w:r>
-        <w:t>Para el paciente</w:t>
+        <w:t>Para el paciente — escena en Valencia</w:t>
+      </w:r>
+    </w:p>
+    <w:p>
+      <w:r>
+        <w:t xml:space="preserve">María, en </w:t>
+      </w:r>
+      <w:r>
+        <w:rPr>
+          <w:b/>
+        </w:rPr>
+        <w:t>Naguanagua</w:t>
+      </w:r>
+      <w:r>
+        <w:t xml:space="preserve">, necesita antibiótico para su hijo. Hoy recorre </w:t>
+      </w:r>
+      <w:r>
+        <w:rPr>
+          <w:b/>
+        </w:rPr>
+        <w:t>tres farmacias</w:t>
+      </w:r>
+      <w:r>
+        <w:t xml:space="preserve"> en Av. Universidad sin saber cuál tiene stock. Con Zonix vería en la app qué farmacia aliada lo tiene, subiría la receta si aplica, pagaría con Pago Móvil y seguiría el envío — sin llamadas en bucle.</w:t>
       </w:r>
     </w:p>
     <w:p>
@@ -489,7 +503,39 @@
         <w:pStyle w:val="Heading2"/>
       </w:pPr>
       <w:r>
-        <w:t>Para la farmacia mediana o independiente</w:t>
+        <w:t>Para la farmacia mediana o independiente — escena en El Socorro</w:t>
+      </w:r>
+    </w:p>
+    <w:p>
+      <w:r>
+        <w:t xml:space="preserve">El dueño recibe </w:t>
+      </w:r>
+      <w:r>
+        <w:rPr>
+          <w:b/>
+        </w:rPr>
+        <w:t>40 pedidos por WhatsApp</w:t>
+      </w:r>
+      <w:r>
+        <w:t xml:space="preserve"> la semana pasada (dato a confirmar en discovery). Los anota en un cuaderno; a las 8 p.m. concilia Pago Móvil a mano. Si entra a PedidosYa, </w:t>
+      </w:r>
+      <w:r>
+        <w:rPr>
+          <w:b/>
+        </w:rPr>
+        <w:t>pierde margen</w:t>
+      </w:r>
+      <w:r>
+        <w:t xml:space="preserve">; si no entra, </w:t>
+      </w:r>
+      <w:r>
+        <w:rPr>
+          <w:b/>
+        </w:rPr>
+        <w:t>pierde clientes jóvenes</w:t>
+      </w:r>
+      <w:r>
+        <w:t>.</w:t>
       </w:r>
     </w:p>
     <w:p>
@@ -526,7 +572,7 @@
         <w:t>20–30%</w:t>
       </w:r>
       <w:r>
-        <w:t xml:space="preserve"> del GMV digital.</w:t>
+        <w:t xml:space="preserve"> de las ventas digitales.</w:t>
       </w:r>
     </w:p>
     <w:p>
@@ -540,7 +586,7 @@
         <w:t>Operación fragmentada:</w:t>
       </w:r>
       <w:r>
-        <w:t xml:space="preserve"> órdenes, inventario, comprobantes y Rx en WhatsApp y papel.</w:t>
+        <w:t xml:space="preserve"> órdenes, inventario, comprobantes y recetas en WhatsApp y papel.</w:t>
       </w:r>
     </w:p>
     <w:p>
@@ -623,7 +669,7 @@
         <w:rPr>
           <w:b/>
         </w:rPr>
-        <w:t>Stack ya construido:</w:t>
+        <w:t>Plataforma ya construida:</w:t>
       </w:r>
       <w:r>
         <w:t xml:space="preserve"> ~4 años de desarrollo; fork al vertical farmacia ya invertido — Fase 0 = 90 días de legal, equipo, onboarding y release en tiendas.</w:t>
@@ -655,6 +701,27 @@
       </w:r>
       <w:r>
         <w:t xml:space="preserve"> Pago Móvil, Zelle y Binance Pay cubren la población bancarizada.</w:t>
+      </w:r>
+    </w:p>
+    <w:p>
+      <w:r/>
+      <w:r>
+        <w:rPr>
+          <w:b/>
+        </w:rPr>
+        <w:t>Riesgo de timing:</w:t>
+      </w:r>
+      <w:r>
+        <w:t xml:space="preserve"> si esperamos 18 meses, PedidosYa puede mejorar condiciones a cadenas medianas y cerrar el espacio. No es urgencia artificial — es </w:t>
+      </w:r>
+      <w:r>
+        <w:rPr>
+          <w:b/>
+        </w:rPr>
+        <w:t>ventana competitiva</w:t>
+      </w:r>
+      <w:r>
+        <w:t xml:space="preserve"> documentada.</w:t>
       </w:r>
     </w:p>
     <w:p>
@@ -690,16 +757,16 @@
         <w:t>25 / 40 / 55</w:t>
       </w:r>
       <w:r>
-        <w:t xml:space="preserve"> + % moderado sobre GMV): estructuralmente muy por debajo del take-rate </w:t>
+        <w:t xml:space="preserve"> + % moderado sobre ventas en app): estructuralmente muy por debajo de la comisión </w:t>
       </w:r>
       <w:r>
         <w:rPr>
           <w:b/>
         </w:rPr>
-        <w:t>20–30% GMV</w:t>
+        <w:t>20–30%</w:t>
       </w:r>
       <w:r>
-        <w:t xml:space="preserve"> típico de PedidosYa en VE.</w:t>
+        <w:t xml:space="preserve"> típica de PedidosYa en VE.</w:t>
       </w:r>
     </w:p>
     <w:p>
@@ -710,7 +777,7 @@
         <w:rPr>
           <w:b/>
         </w:rPr>
-        <w:t>Validación Rx por farmacéutico colegiado de la propia farmacia</w:t>
+        <w:t>Validación de receta por farmacéutico colegiado de la propia farmacia</w:t>
       </w:r>
       <w:r>
         <w:t xml:space="preserve"> dentro de la app — alineado a regulación VE *(dictamen abogado + farmacéutico asesor pendiente pre-Day-D)*.</w:t>
@@ -738,7 +805,7 @@
         <w:rPr>
           <w:b/>
         </w:rPr>
-        <w:t>Plataforma en staging:</w:t>
+        <w:t>Plataforma en entorno de prueba:</w:t>
       </w:r>
       <w:r>
         <w:t xml:space="preserve"> backend con </w:t>
@@ -750,7 +817,7 @@
         <w:t>443 pruebas</w:t>
       </w:r>
       <w:r>
-        <w:t>; Pusher + notificaciones push integrados. Release tiendas + SMS: hitos Fase 0 semanas 7–12.</w:t>
+        <w:t>; notificaciones en tiempo real integradas. Release tiendas + SMS: hitos Fase 0 semanas 7–12.</w:t>
       </w:r>
     </w:p>
     <w:p>
@@ -842,10 +909,10 @@
         <w:rPr>
           <w:b/>
         </w:rPr>
-        <w:t>Moat operativo:</w:t>
+        <w:t>Ventaja operativa:</w:t>
       </w:r>
       <w:r>
-        <w:t xml:space="preserve"> Rx digital por farmacéutico de </w:t>
+        <w:t xml:space="preserve"> receta digital por farmacéutico de </w:t>
       </w:r>
       <w:r>
         <w:rPr>
@@ -860,7 +927,7 @@
         <w:rPr>
           <w:b/>
         </w:rPr>
-        <w:t>switching cost</w:t>
+        <w:t>costo de cambio</w:t>
       </w:r>
       <w:r>
         <w:t xml:space="preserve"> (catálogo, historial, contrato híbrido) + pagos VE nativos.</w:t>
@@ -874,10 +941,10 @@
         <w:rPr>
           <w:b/>
         </w:rPr>
-        <w:t>Flywheel:</w:t>
+        <w:t>Efecto red:</w:t>
       </w:r>
       <w:r>
-        <w:t xml:space="preserve"> más farmacias → más pacientes → más GMV → más reinversión. Marketplace de cuatro lados: farmacia, paciente, delivery, farmacéutico.</w:t>
+        <w:t xml:space="preserve"> más farmacias → más pacientes → más ventas en app → más reinversión comercial. Cuatro actores: farmacia, paciente, delivery, farmacéutico.</w:t>
       </w:r>
     </w:p>
     <w:p>
@@ -1044,7 +1111,7 @@
               <w:rPr>
                 <w:sz w:val="20"/>
               </w:rPr>
-              <w:t>**~159 farmacias activas** (caso central Lean). Casi equilibrio mensual M12 con ARPF **~50** *(placeholder)*</w:t>
+              <w:t>**~159 farmacias activas** (caso central Lean). Casi equilibrio mensual M12 con ingreso medio **~50** *(placeholder)*</w:t>
             </w:r>
           </w:p>
         </w:tc>
@@ -1712,7 +1779,7 @@
               <w:rPr>
                 <w:sz w:val="20"/>
               </w:rPr>
-              <w:t>ARPF</w:t>
+              <w:t>Ingreso medio por farmacia</w:t>
             </w:r>
           </w:p>
         </w:tc>
@@ -2179,6 +2246,36 @@
     </w:tbl>
     <w:p/>
     <w:p>
+      <w:r/>
+      <w:r>
+        <w:rPr>
+          <w:b/>
+        </w:rPr>
+        <w:t>Nota de riesgo:</w:t>
+      </w:r>
+      <w:r>
+        <w:t xml:space="preserve"> si el ingreso real por farmacia cae a </w:t>
+      </w:r>
+      <w:r>
+        <w:rPr>
+          <w:b/>
+        </w:rPr>
+        <w:t>~USD 41/mes</w:t>
+      </w:r>
+      <w:r>
+        <w:t xml:space="preserve">, el ratio LTV/CAC sigue en </w:t>
+      </w:r>
+      <w:r>
+        <w:rPr>
+          <w:b/>
+        </w:rPr>
+        <w:t>~5,9x</w:t>
+      </w:r>
+      <w:r>
+        <w:t xml:space="preserve"> — saludable, pero el equilibrio mensual se retrasa.</w:t>
+      </w:r>
+    </w:p>
+    <w:p>
       <w:r>
         <w:t>────────────────────────────────────────</w:t>
       </w:r>
@@ -2360,7 +2457,7 @@
               <w:rPr>
                 <w:sz w:val="20"/>
               </w:rPr>
-              <w:t>Dev (Flutter/Laravel) junior</w:t>
+              <w:t>Dev junior</w:t>
             </w:r>
           </w:p>
         </w:tc>
@@ -2572,7 +2669,7 @@
               <w:rPr>
                 <w:sz w:val="20"/>
               </w:rPr>
-              <w:t>**Fase 0:** constitución, equipo, HQ, OTP Firebase; onboarding farmacias — **Day-D = T+90**</w:t>
+              <w:t>**Fase 0:** constitución, equipo, HQ, verificación SMS; onboarding farmacias — **Day-D = T+90**</w:t>
             </w:r>
           </w:p>
         </w:tc>
@@ -2628,7 +2725,7 @@
               <w:rPr>
                 <w:sz w:val="20"/>
               </w:rPr>
-              <w:t>**~108–130 activas**; validación Rx en producción; revenue **~USD 5.400–6.500**/mes</w:t>
+              <w:t>**~108–130 activas**; validación de receta en producción; revenue **~USD 5.400–6.500**/mes</w:t>
             </w:r>
           </w:p>
         </w:tc>
@@ -2855,7 +2952,35 @@
               <w:rPr>
                 <w:sz w:val="20"/>
               </w:rPr>
-              <w:t>Implementados en código; OTP paciente vía SMS en Fase 0</w:t>
+              <w:t>Implementados en código; verificación SMS paciente en Fase 0</w:t>
+            </w:r>
+          </w:p>
+        </w:tc>
+      </w:tr>
+      <w:tr>
+        <w:tc>
+          <w:tcPr>
+            <w:tcW w:type="dxa" w:w="4320"/>
+          </w:tcPr>
+          <w:p>
+            <w:r>
+              <w:rPr>
+                <w:sz w:val="20"/>
+              </w:rPr>
+              <w:t>Curva comercial optimista</w:t>
+            </w:r>
+          </w:p>
+        </w:tc>
+        <w:tc>
+          <w:tcPr>
+            <w:tcW w:type="dxa" w:w="4320"/>
+          </w:tcPr>
+          <w:p>
+            <w:r>
+              <w:rPr>
+                <w:sz w:val="20"/>
+              </w:rPr>
+              <w:t>Ajustar metas si discovery en calle muestra cierre &lt;3 firmas/mes/vendedor</w:t>
             </w:r>
           </w:p>
         </w:tc>
@@ -2928,7 +3053,21 @@
         <w:t>¿Qué ajustarías en el mensaje a la farmacia</w:t>
       </w:r>
       <w:r>
-        <w:t xml:space="preserve"> (cuota + % GMV vs. agregador) para que resuene con dueños de farmacia independiente en Valencia?</w:t>
+        <w:t xml:space="preserve"> (cuota + % vs. agregador) para que resuene con dueños de farmacia independiente en Valencia?</w:t>
+      </w:r>
+    </w:p>
+    <w:p>
+      <w:r>
+        <w:t xml:space="preserve">5. </w:t>
+      </w:r>
+      <w:r>
+        <w:rPr>
+          <w:b/>
+        </w:rPr>
+        <w:t>¿Las escenas de paciente (Naguanagua) y farmacia (El Socorro) suenan verosímiles</w:t>
+      </w:r>
+      <w:r>
+        <w:t xml:space="preserve"> o cambiarías el corredor geográfico del ejemplo?</w:t>
       </w:r>
     </w:p>
     <w:p>
@@ -2961,10 +3100,10 @@
         <w:rPr>
           <w:b/>
         </w:rPr>
-        <w:t>ARPF ~USD 50/mes</w:t>
+        <w:t>ingreso medio ~USD 50/mes</w:t>
       </w:r>
       <w:r>
-        <w:t xml:space="preserve"> es placeholder hasta GMV piloto real.</w:t>
+        <w:t xml:space="preserve"> es placeholder hasta ventas piloto reales.</w:t>
       </w:r>
     </w:p>
     <w:p>

</xml_diff>

<commit_message>
docs: alinear pack/CRM a Lean Excel v4 (237.412) y sync envío
Canon SAFE 237.412 / Day-D 187.152 / %GMV 8/7/5; regenera Pack Word 18 docx y PDFs de pitch/CRM Plan A; forense Cola A–C y skills ancla.

Co-authored-by: Cursor <cursoragent@cursor.com>
</commit_message>
<xml_diff>
--- a/docs/Pack_Aliado_Gabriel_Barrios/docx/02_Brief_Una_Pagina.docx
+++ b/docs/Pack_Aliado_Gabriel_Barrios/docx/02_Brief_Una_Pagina.docx
@@ -3,68 +3,35 @@
 <w:document xmlns:wpc="http://schemas.microsoft.com/office/word/2010/wordprocessingCanvas" xmlns:mo="http://schemas.microsoft.com/office/mac/office/2008/main" xmlns:mc="http://schemas.openxmlformats.org/markup-compatibility/2006" xmlns:mv="urn:schemas-microsoft-com:mac:vml" xmlns:o="urn:schemas-microsoft-com:office:office" xmlns:r="http://schemas.openxmlformats.org/officeDocument/2006/relationships" xmlns:m="http://schemas.openxmlformats.org/officeDocument/2006/math" xmlns:v="urn:schemas-microsoft-com:vml" xmlns:wp14="http://schemas.microsoft.com/office/word/2010/wordprocessingDrawing" xmlns:wp="http://schemas.openxmlformats.org/drawingml/2006/wordprocessingDrawing" xmlns:w10="urn:schemas-microsoft-com:office:word" xmlns:w="http://schemas.openxmlformats.org/wordprocessingml/2006/main" xmlns:w14="http://schemas.microsoft.com/office/word/2010/wordml" xmlns:wpg="http://schemas.microsoft.com/office/word/2010/wordprocessingGroup" xmlns:wpi="http://schemas.microsoft.com/office/word/2010/wordprocessingInk" xmlns:wne="http://schemas.microsoft.com/office/word/2006/wordml" xmlns:wps="http://schemas.microsoft.com/office/word/2010/wordprocessingShape" mc:Ignorable="w14 wp14">
   <w:body>
     <w:p>
-      <w:r/>
       <w:r>
         <w:rPr>
-          <w:b/>
+          <w:i/>
         </w:rPr>
-        <w:t>Para:</w:t>
-      </w:r>
-      <w:r>
-        <w:t xml:space="preserve"> Gabriel Barrios — Grupo Morr (Valencia, Venezuela)  </w:t>
+        <w:t>**Espejo Pack Aliado** (sync v7 7-ago-2026) desde Lanzamiento. Canon Excel v4 SAFE **237.412**; pricing **45/60/70 + %GMV 8/7/5**.</w:t>
       </w:r>
     </w:p>
     <w:p>
-      <w:r/>
-      <w:r>
-        <w:rPr>
-          <w:b/>
-        </w:rPr>
-        <w:t>De:</w:t>
-      </w:r>
-      <w:r>
-        <w:t xml:space="preserve"> Abrahan Pulido — Founder / CEO / CTO, Zonix Pharma  </w:t>
+      <w:pPr>
+        <w:pStyle w:val="Title"/>
+      </w:pPr>
+      <w:r>
+        <w:t>Zonix Pharma — Brief de una página</w:t>
       </w:r>
     </w:p>
     <w:p>
-      <w:r/>
       <w:r>
         <w:rPr>
-          <w:b/>
+          <w:i/>
         </w:rPr>
-        <w:t>Fecha:</w:t>
-      </w:r>
-      <w:r>
-        <w:t xml:space="preserve"> junio 2026  </w:t>
+        <w:t>**Última actualización:** 7 agosto 2026 (estado producto: MVP técnico vs evidencia de mercado; Lean **USD 237.412** intacto).</w:t>
       </w:r>
     </w:p>
     <w:p>
-      <w:r/>
       <w:r>
         <w:rPr>
-          <w:b/>
+          <w:i/>
         </w:rPr>
-        <w:t>Qué es este documento:</w:t>
-      </w:r>
-      <w:r>
-        <w:t xml:space="preserve"> brief ampliado con la tesis de negocio, números clave y plan operativo — para evaluar la propuesta con contexto suficiente sin leer el pack completo.  </w:t>
-      </w:r>
-    </w:p>
-    <w:p>
-      <w:r/>
-      <w:r>
-        <w:rPr>
-          <w:b/>
-        </w:rPr>
-        <w:t>No es solicitud de inversión</w:t>
-      </w:r>
-      <w:r>
-        <w:t xml:space="preserve"> por defecto — las cifras de capital se incluyen solo como referencia de viabilidad del plan.</w:t>
-      </w:r>
-    </w:p>
-    <w:p>
-      <w:r>
-        <w:t>────────────────────────────────────────</w:t>
+        <w:t>Documento ancla del pack. Léase primero. Todas las cifras están detalladas en los documentos hermanos del directorio [docs/Lanzamiento/](README.md).</w:t>
       </w:r>
     </w:p>
     <w:p>
@@ -72,13 +39,11 @@
         <w:pStyle w:val="Heading1"/>
       </w:pPr>
       <w:r>
-        <w:t>En 60 segundos</w:t>
+        <w:t>Qué es</w:t>
       </w:r>
     </w:p>
     <w:p>
-      <w:r>
-        <w:t xml:space="preserve">- </w:t>
-      </w:r>
+      <w:r/>
       <w:r>
         <w:rPr>
           <w:b/>
@@ -86,172 +51,184 @@
         <w:t>Zonix Pharma</w:t>
       </w:r>
       <w:r>
-        <w:t xml:space="preserve"> = marketplace farmacéutico en Venezuela (paciente → farmacia independiente → farmacéutico colegiado → partner logístico).</w:t>
-      </w:r>
-    </w:p>
-    <w:p>
-      <w:r>
-        <w:t xml:space="preserve">- </w:t>
+        <w:t xml:space="preserve"> es un marketplace farmacéutico </w:t>
       </w:r>
       <w:r>
         <w:rPr>
           <w:b/>
         </w:rPr>
-        <w:t>Problema:</w:t>
-      </w:r>
-      <w:r>
-        <w:t xml:space="preserve"> farmacias medianas/independientes sin app propia pagan </w:t>
+        <w:t>B2B2C</w:t>
+      </w:r>
+      <w:r>
+        <w:t xml:space="preserve"> en Venezuela: el paciente compra en app; la </w:t>
       </w:r>
       <w:r>
         <w:rPr>
           <w:b/>
         </w:rPr>
-        <w:t>25–35%</w:t>
-      </w:r>
-      <w:r>
-        <w:t xml:space="preserve"> a agregadores o quedan fuera del digital; pacientes recorren farmacias sin saber stock ni precio.</w:t>
-      </w:r>
-    </w:p>
-    <w:p>
-      <w:r>
-        <w:t xml:space="preserve">- </w:t>
+        <w:t>farmacia independiente o mediana</w:t>
+      </w:r>
+      <w:r>
+        <w:t xml:space="preserve"> despacha; un </w:t>
       </w:r>
       <w:r>
         <w:rPr>
           <w:b/>
         </w:rPr>
-        <w:t>Mercado:</w:t>
-      </w:r>
-      <w:r>
-        <w:t xml:space="preserve"> </w:t>
+        <w:t>farmacéutico colegiado de esa farmacia</w:t>
+      </w:r>
+      <w:r>
+        <w:t xml:space="preserve"> valida Rx cuando aplica; la </w:t>
       </w:r>
       <w:r>
         <w:rPr>
           <w:b/>
         </w:rPr>
-        <w:t>USD 1.638M/año</w:t>
-      </w:r>
-      <w:r>
-        <w:t xml:space="preserve"> (+17,49% unidades YoY — Cifar / IMS-IQVIA); </w:t>
+        <w:t>última milla</w:t>
+      </w:r>
+      <w:r>
+        <w:t xml:space="preserve"> la hace un </w:t>
       </w:r>
       <w:r>
         <w:rPr>
           <w:b/>
         </w:rPr>
-        <w:t>226 farmacias</w:t>
-      </w:r>
-      <w:r>
-        <w:t xml:space="preserve"> en Valencia metro.</w:t>
-      </w:r>
-    </w:p>
-    <w:p>
-      <w:r>
-        <w:t xml:space="preserve">- </w:t>
+        <w:t>partner</w:t>
+      </w:r>
+      <w:r>
+        <w:t xml:space="preserve"> (`delivery_company` + agentes) bajo contrato marco — </w:t>
       </w:r>
       <w:r>
         <w:rPr>
           <w:b/>
         </w:rPr>
-        <w:t>Producto:</w:t>
-      </w:r>
-      <w:r>
-        <w:t xml:space="preserve"> ~4 años de desarrollo; entorno de prueba con </w:t>
-      </w:r>
+        <w:t>sin flota propia</w:t>
+      </w:r>
+      <w:r>
+        <w:t xml:space="preserve"> de Zonix.</w:t>
+      </w:r>
+    </w:p>
+    <w:p>
+      <w:r/>
       <w:r>
         <w:rPr>
           <w:b/>
         </w:rPr>
-        <w:t>443 pruebas</w:t>
-      </w:r>
-      <w:r>
-        <w:t xml:space="preserve">; capital va a </w:t>
+        <w:t>Para el inversor (una línea):</w:t>
+      </w:r>
+      <w:r>
+        <w:t xml:space="preserve"> llevamos al canal que hoy paga </w:t>
       </w:r>
       <w:r>
         <w:rPr>
           <w:b/>
         </w:rPr>
-        <w:t>comercializar</w:t>
-      </w:r>
-      <w:r>
-        <w:t>, no a construir desde cero.</w:t>
-      </w:r>
-    </w:p>
-    <w:p>
-      <w:r>
-        <w:t xml:space="preserve">- </w:t>
+        <w:t>20–30%</w:t>
+      </w:r>
+      <w:r>
+        <w:t xml:space="preserve"> a PedidosYa Pharmacy (o no tiene app propia) un stack digital con </w:t>
       </w:r>
       <w:r>
         <w:rPr>
           <w:b/>
         </w:rPr>
-        <w:t>Modelo:</w:t>
-      </w:r>
-      <w:r>
-        <w:t xml:space="preserve"> cuota </w:t>
+        <w:t>fee bajo + Rx validado</w:t>
+      </w:r>
+      <w:r>
+        <w:t xml:space="preserve">, en un mercado pharma </w:t>
       </w:r>
       <w:r>
         <w:rPr>
           <w:b/>
         </w:rPr>
-        <w:t>25/40/55 USD</w:t>
-      </w:r>
-      <w:r>
-        <w:t xml:space="preserve"> + % moderado sobre ventas en app — muy por debajo de agregadores.</w:t>
+        <w:t>existente</w:t>
+      </w:r>
+      <w:r>
+        <w:t xml:space="preserve"> de USD 1,638M/año — no inventamos categoría ([CONTEXTO_PITCH_Y_DECISIONES.md](CONTEXTO_PITCH_Y_DECISIONES.md) §2.9). _(Rappi LatAm 25–35% = benchmark regional, no operador VE.)_</w:t>
       </w:r>
     </w:p>
     <w:p>
-      <w:r>
-        <w:t xml:space="preserve">- </w:t>
-      </w:r>
+      <w:r/>
       <w:r>
         <w:rPr>
           <w:b/>
         </w:rPr>
-        <w:t>Unit economics:</w:t>
-      </w:r>
-      <w:r>
-        <w:t xml:space="preserve"> LTV/CAC </w:t>
+        <w:t>Estado producto:</w:t>
+      </w:r>
+      <w:r>
+        <w:t xml:space="preserve"> vertical farmacia sobre stack </w:t>
       </w:r>
       <w:r>
         <w:rPr>
           <w:b/>
         </w:rPr>
-        <w:t>~7,2x</w:t>
-      </w:r>
-      <w:r>
-        <w:t xml:space="preserve">; </w:t>
+        <w:t>~4 años</w:t>
+      </w:r>
+      <w:r>
+        <w:t xml:space="preserve">; capa Pharma (Rx, roles) </w:t>
       </w:r>
       <w:r>
         <w:rPr>
           <w:b/>
         </w:rPr>
-        <w:t>~159 farmacias activas M12</w:t>
-      </w:r>
-      <w:r>
-        <w:t xml:space="preserve">; capital Lean </w:t>
+        <w:t>~30–45 días</w:t>
+      </w:r>
+      <w:r>
+        <w:t xml:space="preserve"> ya invertidos. </w:t>
       </w:r>
       <w:r>
         <w:rPr>
           <w:b/>
         </w:rPr>
-        <w:t>~USD 112k</w:t>
-      </w:r>
-      <w:r>
-        <w:t xml:space="preserve"> / SAFE cap </w:t>
+        <w:t>Hoy (MVP técnico):</w:t>
+      </w:r>
+      <w:r>
+        <w:t xml:space="preserve"> staging/VPS (`zonixpharma.com` / `pharma.aiblockweb.com`), </w:t>
       </w:r>
       <w:r>
         <w:rPr>
           <w:b/>
         </w:rPr>
-        <w:t>600.000</w:t>
-      </w:r>
-      <w:r>
-        <w:t xml:space="preserve"> *(referencia)*.</w:t>
-      </w:r>
-    </w:p>
-    <w:p>
-      <w:r>
-        <w:t>────────────────────────────────────────</w:t>
+        <w:t>443</w:t>
+      </w:r>
+      <w:r>
+        <w:t xml:space="preserve"> tests backend (re-verificar pre-reunión); Flutter en verde. </w:t>
+      </w:r>
+      <w:r>
+        <w:rPr>
+          <w:b/>
+        </w:rPr>
+        <w:t>Evidencia de mercado (en curso):</w:t>
+      </w:r>
+      <w:r>
+        <w:t xml:space="preserve"> demo producto 3–5 min + early adopters Valencia — ver [APRENDIZAJE_500_EVIDENCIA_MERCADO.md](APRENDIZAJE_500_EVIDENCIA_MERCADO.md). </w:t>
+      </w:r>
+      <w:r>
+        <w:rPr>
+          <w:b/>
+        </w:rPr>
+        <w:t>Aún no:</w:t>
+      </w:r>
+      <w:r>
+        <w:t xml:space="preserve"> Play Store / piloto con farmacias reales a escala. </w:t>
+      </w:r>
+      <w:r>
+        <w:rPr>
+          <w:b/>
+        </w:rPr>
+        <w:t>Day-D (T+90):</w:t>
+      </w:r>
+      <w:r>
+        <w:t xml:space="preserve"> OTP Firebase + tiendas + smoke E2E — hitos </w:t>
+      </w:r>
+      <w:r>
+        <w:rPr>
+          <w:b/>
+        </w:rPr>
+        <w:t>T+7–12</w:t>
+      </w:r>
+      <w:r>
+        <w:t xml:space="preserve"> Fase 0.</w:t>
       </w:r>
     </w:p>
     <w:p>
@@ -259,7 +236,12 @@
         <w:pStyle w:val="Heading1"/>
       </w:pPr>
       <w:r>
-        <w:t>Qué es Zonix Pharma</w:t>
+        <w:t>Problema que resuelve</w:t>
+      </w:r>
+    </w:p>
+    <w:p>
+      <w:r>
+        <w:t>_StoryBrand — el paciente es el héroe; Zonix es la guía. Sin promesas terapéuticas._</w:t>
       </w:r>
     </w:p>
     <w:p>
@@ -268,55 +250,89 @@
         <w:rPr>
           <w:b/>
         </w:rPr>
-        <w:t>Zonix Pharma</w:t>
-      </w:r>
-      <w:r>
-        <w:t xml:space="preserve"> conecta en una sola app al </w:t>
+        <w:t>Para el paciente</w:t>
+      </w:r>
+      <w:r>
+        <w:t xml:space="preserve"> _(problema externo: tiempo, stock, precio, receta)_</w:t>
+      </w:r>
+    </w:p>
+    <w:p>
+      <w:r>
+        <w:t xml:space="preserve">1. </w:t>
       </w:r>
       <w:r>
         <w:rPr>
           <w:b/>
         </w:rPr>
-        <w:t>paciente</w:t>
-      </w:r>
-      <w:r>
-        <w:t xml:space="preserve">, la </w:t>
+        <w:t>Stock incierto y tiempo perdido:</w:t>
+      </w:r>
+      <w:r>
+        <w:t xml:space="preserve"> recorrer 3–5 farmacias sin saber si tendrán el medicamento.</w:t>
+      </w:r>
+    </w:p>
+    <w:p>
+      <w:r>
+        <w:t xml:space="preserve">2. </w:t>
       </w:r>
       <w:r>
         <w:rPr>
           <w:b/>
         </w:rPr>
-        <w:t>farmacia independiente o mediana</w:t>
-      </w:r>
-      <w:r>
-        <w:t xml:space="preserve">, el </w:t>
+        <w:t>Precio opaco:</w:t>
+      </w:r>
+      <w:r>
+        <w:t xml:space="preserve"> sin comparador entre farmacias afiliadas, puede pagar más en la primera opción _(hipótesis piloto </w:t>
       </w:r>
       <w:r>
         <w:rPr>
           <w:b/>
         </w:rPr>
-        <w:t>farmacéutico colegiado de esa farmacia</w:t>
-      </w:r>
-      <w:r>
-        <w:t xml:space="preserve"> y una </w:t>
+        <w:t>15–25%</w:t>
+      </w:r>
+      <w:r>
+        <w:t>, no garantizada — [PROPUESTA_VALOR_USUARIO_FINAL.md](PROPUESTA_VALOR_USUARIO_FINAL.md))_.</w:t>
+      </w:r>
+    </w:p>
+    <w:p>
+      <w:r>
+        <w:t xml:space="preserve">3. </w:t>
       </w:r>
       <w:r>
         <w:rPr>
           <w:b/>
         </w:rPr>
-        <w:t>empresa de delivery</w:t>
-      </w:r>
-      <w:r>
-        <w:t xml:space="preserve"> que ejecuta la última milla. Zonix </w:t>
+        <w:t>Entrega sin trazabilidad:</w:t>
+      </w:r>
+      <w:r>
+        <w:t xml:space="preserve"> el pedido “sale” pero no hay seguimiento en tiempo real ni visibilidad del repartidor partner.</w:t>
+      </w:r>
+    </w:p>
+    <w:p>
+      <w:r>
+        <w:t xml:space="preserve">4. </w:t>
       </w:r>
       <w:r>
         <w:rPr>
           <w:b/>
         </w:rPr>
-        <w:t>no</w:t>
-      </w:r>
-      <w:r>
-        <w:t xml:space="preserve"> compra medicamentos ni opera motos propias.</w:t>
+        <w:t>Receta en papel:</w:t>
+      </w:r>
+      <w:r>
+        <w:t xml:space="preserve"> se pierde o se daña; quien paga desde el exterior no puede coordinar pedido y receta de forma digital.</w:t>
+      </w:r>
+    </w:p>
+    <w:p>
+      <w:r>
+        <w:t xml:space="preserve">5. </w:t>
+      </w:r>
+      <w:r>
+        <w:rPr>
+          <w:b/>
+        </w:rPr>
+        <w:t>Dudas antes de comprar:</w:t>
+      </w:r>
+      <w:r>
+        <w:t xml:space="preserve"> sin canal rápido para orientación informativa (genérico vs. original, etc.) — _asistente IA en roadmap Año 1 (no piloto)_.</w:t>
       </w:r>
     </w:p>
     <w:p>
@@ -325,28 +341,98 @@
         <w:rPr>
           <w:b/>
         </w:rPr>
-        <w:t>En una línea:</w:t>
-      </w:r>
-      <w:r>
-        <w:t xml:space="preserve"> llevamos al canal que hoy paga 25–35% a agregadores o no tiene app propia un stack digital con </w:t>
+        <w:t>Para la farmacia mediana o independiente</w:t>
+      </w:r>
+      <w:r>
+        <w:t xml:space="preserve"> _(problema externo: visibilidad, costo agregador, operación)_</w:t>
+      </w:r>
+    </w:p>
+    <w:p>
+      <w:r>
+        <w:t xml:space="preserve">1. </w:t>
       </w:r>
       <w:r>
         <w:rPr>
           <w:b/>
         </w:rPr>
-        <w:t>costo bajo + receta validada</w:t>
-      </w:r>
-      <w:r>
-        <w:t xml:space="preserve">, en un mercado pharma </w:t>
+        <w:t>Competir sin app propia</w:t>
+      </w:r>
+      <w:r>
+        <w:t xml:space="preserve"> frente a cadenas premium (Farmatodo, Locatel) y agregadores, sin marketplace ni delivery integrado.</w:t>
+      </w:r>
+    </w:p>
+    <w:p>
+      <w:r>
+        <w:t xml:space="preserve">2. </w:t>
       </w:r>
       <w:r>
         <w:rPr>
           <w:b/>
         </w:rPr>
-        <w:t>existente</w:t>
-      </w:r>
-      <w:r>
-        <w:t xml:space="preserve"> de USD 1,638M/año — no inventamos categoría.</w:t>
+        <w:t>Comisión alta en agregadores:</w:t>
+      </w:r>
+      <w:r>
+        <w:t xml:space="preserve"> </w:t>
+      </w:r>
+      <w:r>
+        <w:rPr>
+          <w:b/>
+        </w:rPr>
+        <w:t>PedidosYa</w:t>
+      </w:r>
+      <w:r>
+        <w:t xml:space="preserve"> (VE) suele retener </w:t>
+      </w:r>
+      <w:r>
+        <w:rPr>
+          <w:b/>
+        </w:rPr>
+        <w:t>20–30%</w:t>
+      </w:r>
+      <w:r>
+        <w:t xml:space="preserve"> del GMV digital; paga mucho sin herramientas propias de gestión. _(Rappi: referencia LatAm, no opera en VE.)_</w:t>
+      </w:r>
+    </w:p>
+    <w:p>
+      <w:r>
+        <w:t xml:space="preserve">3. </w:t>
+      </w:r>
+      <w:r>
+        <w:rPr>
+          <w:b/>
+        </w:rPr>
+        <w:t>Operación fragmentada:</w:t>
+      </w:r>
+      <w:r>
+        <w:t xml:space="preserve"> órdenes, inventario, comprobantes y Rx en WhatsApp y papel; poca trazabilidad y retrabajo.</w:t>
+      </w:r>
+    </w:p>
+    <w:p>
+      <w:r>
+        <w:t xml:space="preserve">4. </w:t>
+      </w:r>
+      <w:r>
+        <w:rPr>
+          <w:b/>
+        </w:rPr>
+        <w:t>Captación limitada:</w:t>
+      </w:r>
+      <w:r>
+        <w:t xml:space="preserve"> depende del tráfico a pie; poca coordinación entre marketing digital y presencia física.</w:t>
+      </w:r>
+    </w:p>
+    <w:p>
+      <w:r>
+        <w:t xml:space="preserve">5. </w:t>
+      </w:r>
+      <w:r>
+        <w:rPr>
+          <w:b/>
+        </w:rPr>
+        <w:t>Compras a droguerías sin comparador:</w:t>
+      </w:r>
+      <w:r>
+        <w:t xml:space="preserve"> catálogos en PDF/WhatsApp — _módulo proveedores en roadmap Año 1 (no piloto)_.</w:t>
       </w:r>
     </w:p>
     <w:p>
@@ -355,33 +441,22 @@
         <w:rPr>
           <w:b/>
         </w:rPr>
-        <w:t>Estado producto:</w:t>
-      </w:r>
-      <w:r>
-        <w:t xml:space="preserve"> vertical farmacia sobre plataforma de ~4 años; capa de receta y roles farmacéuticos ya invertida. Hoy: entorno de prueba operativo, </w:t>
+        <w:t>Para el ecosistema</w:t>
+      </w:r>
+      <w:r/>
+    </w:p>
+    <w:p>
+      <w:r>
+        <w:t xml:space="preserve">- La receta médica venezolana sigue siendo física y vulnerable a errores. Zonix digitaliza la </w:t>
       </w:r>
       <w:r>
         <w:rPr>
           <w:b/>
         </w:rPr>
-        <w:t>443 pruebas</w:t>
-      </w:r>
-      <w:r>
-        <w:t xml:space="preserve"> backend; app móvil sin errores críticos en análisis estático. </w:t>
-      </w:r>
-      <w:r>
-        <w:rPr>
-          <w:b/>
-        </w:rPr>
-        <w:t>Day-D (T+90):</w:t>
-      </w:r>
-      <w:r>
-        <w:t xml:space="preserve"> verificación SMS + tiendas + prueba integral — hitos semanas 7–12 de Fase 0.</w:t>
-      </w:r>
-    </w:p>
-    <w:p>
-      <w:r>
-        <w:t>────────────────────────────────────────</w:t>
+        <w:t>validación</w:t>
+      </w:r>
+      <w:r>
+        <w:t xml:space="preserve"> con el farmacéutico colegiado de cada farmacia — no sustituye al criterio médico ni al titular de la farmacia.</w:t>
       </w:r>
     </w:p>
     <w:p>
@@ -389,12 +464,400 @@
         <w:pStyle w:val="Heading1"/>
       </w:pPr>
       <w:r>
-        <w:t>Problema que resuelve</w:t>
+        <w:t>Por qué ahora (timing)</w:t>
       </w:r>
     </w:p>
     <w:p>
       <w:r>
-        <w:t>*El paciente es el héroe; Zonix es la guía. Sin promesas terapéuticas.*</w:t>
+        <w:t xml:space="preserve">1. </w:t>
+      </w:r>
+      <w:r>
+        <w:rPr>
+          <w:b/>
+        </w:rPr>
+        <w:t>Mercado pharma VE está en recuperación post-crisis:</w:t>
+      </w:r>
+      <w:r>
+        <w:t xml:space="preserve"> +17,49% YoY en unidades 2024-2025 (</w:t>
+      </w:r>
+      <w:r>
+        <w:rPr>
+          <w:b/>
+        </w:rPr>
+        <w:t>Cifar</w:t>
+      </w:r>
+      <w:r>
+        <w:t xml:space="preserve">, datos IMS/IQVIA). Hace 2 años el mercado se contraía; en 2 años más estará cubierto por competidores digitales. </w:t>
+      </w:r>
+      <w:r>
+        <w:rPr>
+          <w:b/>
+        </w:rPr>
+        <w:t>2026 es la ventana.</w:t>
+      </w:r>
+      <w:r/>
+    </w:p>
+    <w:p>
+      <w:r>
+        <w:t xml:space="preserve">2. </w:t>
+      </w:r>
+      <w:r>
+        <w:rPr>
+          <w:b/>
+        </w:rPr>
+        <w:t>Stack ya construido:</w:t>
+      </w:r>
+      <w:r>
+        <w:t xml:space="preserve"> el </w:t>
+      </w:r>
+      <w:r>
+        <w:rPr>
+          <w:b/>
+        </w:rPr>
+        <w:t>stack Zonix Pharma</w:t>
+      </w:r>
+      <w:r>
+        <w:t xml:space="preserve"> lleva ~4 años de desarrollo; el </w:t>
+      </w:r>
+      <w:r>
+        <w:rPr>
+          <w:b/>
+        </w:rPr>
+        <w:t>fork al vertical farmacia</w:t>
+      </w:r>
+      <w:r>
+        <w:t xml:space="preserve"> (capa Rx, roles Pharma) equivale a </w:t>
+      </w:r>
+      <w:r>
+        <w:rPr>
+          <w:b/>
+        </w:rPr>
+        <w:t>~30–45 días de esfuerzo de producto</w:t>
+      </w:r>
+      <w:r>
+        <w:t xml:space="preserve"> ya invertido — </w:t>
+      </w:r>
+      <w:r>
+        <w:rPr>
+          <w:b/>
+        </w:rPr>
+        <w:t>no</w:t>
+      </w:r>
+      <w:r>
+        <w:t xml:space="preserve"> confundir con </w:t>
+      </w:r>
+      <w:r>
+        <w:rPr>
+          <w:b/>
+        </w:rPr>
+        <w:t>Fase 0 = T+90</w:t>
+      </w:r>
+      <w:r>
+        <w:t xml:space="preserve"> (legal, equipo, onboarding farmacias y release en tiendas antes de Day-D — [PLAN_LANZAMIENTO_COMERCIAL.md](PLAN_LANZAMIENTO_COMERCIAL.md)).</w:t>
+      </w:r>
+    </w:p>
+    <w:p>
+      <w:r>
+        <w:t xml:space="preserve">3. </w:t>
+      </w:r>
+      <w:r>
+        <w:rPr>
+          <w:b/>
+        </w:rPr>
+        <w:t>Competencia digital débil en VE:</w:t>
+      </w:r>
+      <w:r>
+        <w:t xml:space="preserve"> </w:t>
+      </w:r>
+      <w:r>
+        <w:rPr>
+          <w:b/>
+        </w:rPr>
+        <w:t>PedidosYa Pharmacy</w:t>
+      </w:r>
+      <w:r>
+        <w:t xml:space="preserve"> cubre cadenas e independientes en marketplace generalista. Farmatodo y Locatel no abren marketplace B2B. </w:t>
+      </w:r>
+      <w:r>
+        <w:rPr>
+          <w:b/>
+        </w:rPr>
+        <w:t>Early mover</w:t>
+      </w:r>
+      <w:r>
+        <w:t xml:space="preserve"> en farmacias medianas e independientes (Valencia metro) — mercado </w:t>
+      </w:r>
+      <w:r>
+        <w:rPr>
+          <w:b/>
+        </w:rPr>
+        <w:t>existente</w:t>
+      </w:r>
+      <w:r>
+        <w:t>, no categoría nueva ([CONTEXTO_PITCH_Y_DECISIONES.md](CONTEXTO_PITCH_Y_DECISIONES.md) §2.9).</w:t>
+      </w:r>
+    </w:p>
+    <w:p>
+      <w:r>
+        <w:t xml:space="preserve">4. </w:t>
+      </w:r>
+      <w:r>
+        <w:rPr>
+          <w:b/>
+        </w:rPr>
+        <w:t>Métodos de pago manuales VE están maduros:</w:t>
+      </w:r>
+      <w:r>
+        <w:t xml:space="preserve"> Pago Móvil C2P + Zelle + Binance Pay USDT cubren el 95% de la población bancarizada. Hace 5 años no era posible.</w:t>
+      </w:r>
+    </w:p>
+    <w:p>
+      <w:pPr>
+        <w:pStyle w:val="Heading1"/>
+      </w:pPr>
+      <w:r>
+        <w:t>Diferenciadores claros</w:t>
+      </w:r>
+    </w:p>
+    <w:p>
+      <w:r>
+        <w:t xml:space="preserve">- </w:t>
+      </w:r>
+      <w:r>
+        <w:rPr>
+          <w:b/>
+        </w:rPr>
+        <w:t>Modelo B2B híbrido en USD</w:t>
+      </w:r>
+      <w:r>
+        <w:t xml:space="preserve"> (cuota fija </w:t>
+      </w:r>
+      <w:r>
+        <w:rPr>
+          <w:b/>
+        </w:rPr>
+        <w:t>45 / 60 / 70</w:t>
+      </w:r>
+      <w:r>
+        <w:t xml:space="preserve"> + </w:t>
+      </w:r>
+      <w:r>
+        <w:rPr>
+          <w:b/>
+        </w:rPr>
+        <w:t>%GMV 8 / 7 / 5</w:t>
+      </w:r>
+      <w:r>
+        <w:t xml:space="preserve"> según banda — esc.1 v4): estructuralmente muy por debajo del take-rate </w:t>
+      </w:r>
+      <w:r>
+        <w:rPr>
+          <w:b/>
+        </w:rPr>
+        <w:t>20–30% GMV</w:t>
+      </w:r>
+      <w:r>
+        <w:t xml:space="preserve"> típico de </w:t>
+      </w:r>
+      <w:r>
+        <w:rPr>
+          <w:b/>
+        </w:rPr>
+        <w:t>PedidosYa</w:t>
+      </w:r>
+      <w:r>
+        <w:t xml:space="preserve"> en VE. Detalle en [PROPUESTA_VALOR_CLIENTE_B2B.md](PROPUESTA_VALOR_CLIENTE_B2B.md) §5.</w:t>
+      </w:r>
+    </w:p>
+    <w:p>
+      <w:r>
+        <w:t xml:space="preserve">- </w:t>
+      </w:r>
+      <w:r>
+        <w:rPr>
+          <w:b/>
+        </w:rPr>
+        <w:t>Validación Rx por farmacéutico colegiado de la propia farmacia</w:t>
+      </w:r>
+      <w:r>
+        <w:t xml:space="preserve"> dentro de la app, ya construida en backend. Modelo alineado a regulación farmacéutica VE _[PENDIENTE dictamen abogado + farmacéutico asesor antes de Day-D]_; Zonix </w:t>
+      </w:r>
+      <w:r>
+        <w:rPr>
+          <w:b/>
+        </w:rPr>
+        <w:t>no</w:t>
+      </w:r>
+      <w:r>
+        <w:t xml:space="preserve"> sustituye al farmacéutico titular de la farmacia.</w:t>
+      </w:r>
+    </w:p>
+    <w:p>
+      <w:r>
+        <w:t xml:space="preserve">- </w:t>
+      </w:r>
+      <w:r>
+        <w:rPr>
+          <w:b/>
+        </w:rPr>
+        <w:t>Métodos de pago manuales VE soportados nativos:</w:t>
+      </w:r>
+      <w:r>
+        <w:t xml:space="preserve"> Pago Móvil C2P, transferencia, Zelle, Binance Pay USDT — sin pasarelas internacionales caras, sin Stripe, sin necesidad de cuenta empresarial extranjera para operar.</w:t>
+      </w:r>
+    </w:p>
+    <w:p>
+      <w:r>
+        <w:t xml:space="preserve">- </w:t>
+      </w:r>
+      <w:r>
+        <w:rPr>
+          <w:b/>
+        </w:rPr>
+        <w:t>Stack en staging/VPS</w:t>
+      </w:r>
+      <w:r>
+        <w:t xml:space="preserve"> (go-live público T+7–12 Fase 0): backend con </w:t>
+      </w:r>
+      <w:r>
+        <w:rPr>
+          <w:b/>
+        </w:rPr>
+        <w:t>443</w:t>
+      </w:r>
+      <w:r>
+        <w:t xml:space="preserve"> tests pasando (re-verificar pre-reunión); frontend Flutter sin issues en analyze; Pusher + FCM integrados en código. </w:t>
+      </w:r>
+      <w:r>
+        <w:rPr>
+          <w:b/>
+        </w:rPr>
+        <w:t>Release tiendas + Firebase OTP (SMS):</w:t>
+      </w:r>
+      <w:r>
+        <w:t xml:space="preserve"> hitos </w:t>
+      </w:r>
+      <w:r>
+        <w:rPr>
+          <w:b/>
+        </w:rPr>
+        <w:t>T+7–12</w:t>
+      </w:r>
+      <w:r>
+        <w:t xml:space="preserve"> de Fase 0 — no asumir Play/App Store el día del wire ([PLAN_LANZAMIENTO_COMERCIAL.md](PLAN_LANZAMIENTO_COMERCIAL.md), [ALINEACION_LANZAMIENTO_VS_PRODUCTO_2026-05.md](ALINEACION_LANZAMIENTO_VS_PRODUCTO_2026-05.md)).</w:t>
+      </w:r>
+    </w:p>
+    <w:p>
+      <w:r>
+        <w:t xml:space="preserve">- </w:t>
+      </w:r>
+      <w:r>
+        <w:rPr>
+          <w:b/>
+        </w:rPr>
+        <w:t>Equipo lean:</w:t>
+      </w:r>
+      <w:r>
+        <w:t xml:space="preserve"> </w:t>
+      </w:r>
+      <w:r>
+        <w:rPr>
+          <w:b/>
+        </w:rPr>
+        <w:t>CEO</w:t>
+      </w:r>
+      <w:r>
+        <w:t xml:space="preserve"> + </w:t>
+      </w:r>
+      <w:r>
+        <w:rPr>
+          <w:b/>
+        </w:rPr>
+        <w:t>Founder CEO/CTO</w:t>
+      </w:r>
+      <w:r>
+        <w:t xml:space="preserve"> + </w:t>
+      </w:r>
+      <w:r>
+        <w:rPr>
+          <w:b/>
+        </w:rPr>
+        <w:t>Co-CEO</w:t>
+      </w:r>
+      <w:r>
+        <w:t xml:space="preserve"> + </w:t>
+      </w:r>
+      <w:r>
+        <w:rPr>
+          <w:b/>
+        </w:rPr>
+        <w:t>Dev</w:t>
+      </w:r>
+      <w:r>
+        <w:t xml:space="preserve"> + </w:t>
+      </w:r>
+      <w:r>
+        <w:rPr>
+          <w:b/>
+        </w:rPr>
+        <w:t>4× Sales</w:t>
+      </w:r>
+      <w:r>
+        <w:t xml:space="preserve"> + </w:t>
+      </w:r>
+      <w:r>
+        <w:rPr>
+          <w:b/>
+        </w:rPr>
+        <w:t>CS/CM</w:t>
+      </w:r>
+      <w:r>
+        <w:t xml:space="preserve"> + externos (contador/abogado) en tier </w:t>
+      </w:r>
+      <w:r>
+        <w:rPr>
+          <w:b/>
+        </w:rPr>
+        <w:t>Lean 237.412</w:t>
+      </w:r>
+      <w:r>
+        <w:t xml:space="preserve"> (bootstrap </w:t>
+      </w:r>
+      <w:r>
+        <w:rPr>
+          <w:b/>
+        </w:rPr>
+        <w:t>Carabobo independientes</w:t>
+      </w:r>
+      <w:r>
+        <w:t xml:space="preserve">). Runway </w:t>
+      </w:r>
+      <w:r>
+        <w:rPr>
+          <w:b/>
+        </w:rPr>
+        <w:t>Fase 0 + 12 meses</w:t>
+      </w:r>
+      <w:r>
+        <w:t xml:space="preserve"> post-Day-D con </w:t>
+      </w:r>
+      <w:r>
+        <w:rPr>
+          <w:b/>
+        </w:rPr>
+        <w:t>USD 237.412</w:t>
+      </w:r>
+      <w:r>
+        <w:t xml:space="preserve">. Founder técnico: </w:t>
+      </w:r>
+      <w:r>
+        <w:rPr>
+          <w:b/>
+        </w:rPr>
+        <w:t>Abrahan Pulido</w:t>
+      </w:r>
+      <w:r>
+        <w:t>.</w:t>
       </w:r>
     </w:p>
     <w:p>
@@ -402,100 +865,94 @@
         <w:pStyle w:val="Heading2"/>
       </w:pPr>
       <w:r>
-        <w:t>Para el paciente — escena en Valencia</w:t>
+        <w:t>Liquidez y defensibilidad (marketplace)</w:t>
       </w:r>
     </w:p>
     <w:p>
       <w:r>
-        <w:t xml:space="preserve">María, en </w:t>
+        <w:t xml:space="preserve">- </w:t>
       </w:r>
       <w:r>
         <w:rPr>
           <w:b/>
         </w:rPr>
-        <w:t>Naguanagua</w:t>
-      </w:r>
-      <w:r>
-        <w:t xml:space="preserve">, necesita antibiótico para su hijo. Hoy recorre </w:t>
+        <w:t>Oferta primero:</w:t>
+      </w:r>
+      <w:r>
+        <w:t xml:space="preserve"> </w:t>
       </w:r>
       <w:r>
         <w:rPr>
           <w:b/>
         </w:rPr>
-        <w:t>tres farmacias</w:t>
-      </w:r>
-      <w:r>
-        <w:t xml:space="preserve"> en Av. Universidad sin saber cuál tiene stock. Con Zonix vería en la app qué farmacia aliada lo tiene, subiría la receta si aplica, pagaría con Pago Móvil y seguiría el envío — sin llamadas en bucle.</w:t>
-      </w:r>
-    </w:p>
-    <w:p>
-      <w:r>
-        <w:t xml:space="preserve">1. </w:t>
+        <w:t>4× Sales</w:t>
+      </w:r>
+      <w:r>
+        <w:t xml:space="preserve"> + catálogo en farmacias piloto </w:t>
       </w:r>
       <w:r>
         <w:rPr>
           <w:b/>
         </w:rPr>
-        <w:t>Stock incierto y tiempo perdido:</w:t>
-      </w:r>
-      <w:r>
-        <w:t xml:space="preserve"> recorrer 3–5 farmacias sin saber si tendrán el medicamento.</w:t>
-      </w:r>
-    </w:p>
-    <w:p>
-      <w:r>
-        <w:t xml:space="preserve">2. </w:t>
+        <w:t>antes</w:t>
+      </w:r>
+      <w:r>
+        <w:t xml:space="preserve"> de tráfico masivo a pacientes; </w:t>
       </w:r>
       <w:r>
         <w:rPr>
           <w:b/>
         </w:rPr>
-        <w:t>Precio opaco:</w:t>
-      </w:r>
-      <w:r>
-        <w:t xml:space="preserve"> sin comparador entre farmacias afiliadas, puede pagar más en la primera opción *(hipótesis piloto 15–25%, no garantizada)*.</w:t>
+        <w:t>~40 activas</w:t>
+      </w:r>
+      <w:r>
+        <w:t xml:space="preserve"> en M1 ([MODELO_FINANCIERO_ZONIX_PHARMA.md](MODELO_FINANCIERO_ZONIX_PHARMA.md) S3.1 — curva `[PENDIENTE]` vs burn v4).</w:t>
       </w:r>
     </w:p>
     <w:p>
       <w:r>
-        <w:t xml:space="preserve">3. </w:t>
+        <w:t xml:space="preserve">- </w:t>
       </w:r>
       <w:r>
         <w:rPr>
           <w:b/>
         </w:rPr>
-        <w:t>Entrega sin trazabilidad:</w:t>
-      </w:r>
-      <w:r>
-        <w:t xml:space="preserve"> el pedido “sale” pero no hay seguimiento en tiempo real.</w:t>
-      </w:r>
-    </w:p>
-    <w:p>
-      <w:r>
-        <w:t xml:space="preserve">4. </w:t>
+        <w:t>Moat operativo:</w:t>
+      </w:r>
+      <w:r>
+        <w:t xml:space="preserve"> Rx digital por farmacéutico de </w:t>
       </w:r>
       <w:r>
         <w:rPr>
           <w:b/>
         </w:rPr>
-        <w:t>Receta en papel:</w:t>
-      </w:r>
-      <w:r>
-        <w:t xml:space="preserve"> se pierde o se daña; quien paga desde el exterior no puede coordinar pedido y receta de forma digital.</w:t>
-      </w:r>
-    </w:p>
-    <w:p>
-      <w:r>
-        <w:t xml:space="preserve">5. </w:t>
+        <w:t>cada</w:t>
+      </w:r>
+      <w:r>
+        <w:t xml:space="preserve"> farmacia + </w:t>
       </w:r>
       <w:r>
         <w:rPr>
           <w:b/>
         </w:rPr>
-        <w:t>Dudas antes de comprar:</w:t>
-      </w:r>
-      <w:r>
-        <w:t xml:space="preserve"> sin canal rápido para orientación informativa — asistente IA en roadmap Año 1 (no piloto).</w:t>
+        <w:t>switching cost</w:t>
+      </w:r>
+      <w:r>
+        <w:t xml:space="preserve"> (catálogo, historial, contrato híbrido) + pagos VE nativos — no solo «llegamos primero» (§2.11 CONTEXTO).</w:t>
+      </w:r>
+    </w:p>
+    <w:p>
+      <w:r>
+        <w:t xml:space="preserve">- </w:t>
+      </w:r>
+      <w:r>
+        <w:rPr>
+          <w:b/>
+        </w:rPr>
+        <w:t>Flywheel + 4 lados:</w:t>
+      </w:r>
+      <w:r>
+        <w:t xml:space="preserve"> más farmacias → más pacientes → más GMV → más reinversión ([PLAN_LANZAMIENTO_COMERCIAL.md](PLAN_LANZAMIENTO_COMERCIAL.md) §4.4); modelo marketplace de cuatro lados (farmacia, paciente, delivery, farmacéutico) en [PROPUESTA_VALOR_TERCER_LADO.md](PROPUESTA_VALOR_TERCER_LADO.md). Vista Business Model Canvas: CONTEXTO §2.12.</w:t>
       </w:r>
     </w:p>
     <w:p>
@@ -503,461 +960,7 @@
         <w:pStyle w:val="Heading2"/>
       </w:pPr>
       <w:r>
-        <w:t>Para la farmacia mediana o independiente — escena en El Socorro</w:t>
-      </w:r>
-    </w:p>
-    <w:p>
-      <w:r>
-        <w:t xml:space="preserve">El dueño recibe </w:t>
-      </w:r>
-      <w:r>
-        <w:rPr>
-          <w:b/>
-        </w:rPr>
-        <w:t>40 pedidos por WhatsApp</w:t>
-      </w:r>
-      <w:r>
-        <w:t xml:space="preserve"> la semana pasada (dato a confirmar en discovery). Los anota en un cuaderno; a las 8 p.m. concilia Pago Móvil a mano. Si entra a PedidosYa, </w:t>
-      </w:r>
-      <w:r>
-        <w:rPr>
-          <w:b/>
-        </w:rPr>
-        <w:t>pierde margen</w:t>
-      </w:r>
-      <w:r>
-        <w:t xml:space="preserve">; si no entra, </w:t>
-      </w:r>
-      <w:r>
-        <w:rPr>
-          <w:b/>
-        </w:rPr>
-        <w:t>pierde clientes jóvenes</w:t>
-      </w:r>
-      <w:r>
-        <w:t>.</w:t>
-      </w:r>
-    </w:p>
-    <w:p>
-      <w:r>
-        <w:t xml:space="preserve">1. </w:t>
-      </w:r>
-      <w:r>
-        <w:rPr>
-          <w:b/>
-        </w:rPr>
-        <w:t>Competir sin app propia</w:t>
-      </w:r>
-      <w:r>
-        <w:t xml:space="preserve"> frente a cadenas premium (Farmatodo, Locatel) y agregadores.</w:t>
-      </w:r>
-    </w:p>
-    <w:p>
-      <w:r>
-        <w:t xml:space="preserve">2. </w:t>
-      </w:r>
-      <w:r>
-        <w:rPr>
-          <w:b/>
-        </w:rPr>
-        <w:t>Comisión alta en agregadores:</w:t>
-      </w:r>
-      <w:r>
-        <w:t xml:space="preserve"> PedidosYa (VE) suele retener </w:t>
-      </w:r>
-      <w:r>
-        <w:rPr>
-          <w:b/>
-        </w:rPr>
-        <w:t>20–30%</w:t>
-      </w:r>
-      <w:r>
-        <w:t xml:space="preserve"> de las ventas digitales.</w:t>
-      </w:r>
-    </w:p>
-    <w:p>
-      <w:r>
-        <w:t xml:space="preserve">3. </w:t>
-      </w:r>
-      <w:r>
-        <w:rPr>
-          <w:b/>
-        </w:rPr>
-        <w:t>Operación fragmentada:</w:t>
-      </w:r>
-      <w:r>
-        <w:t xml:space="preserve"> órdenes, inventario, comprobantes y recetas en WhatsApp y papel.</w:t>
-      </w:r>
-    </w:p>
-    <w:p>
-      <w:r>
-        <w:t xml:space="preserve">4. </w:t>
-      </w:r>
-      <w:r>
-        <w:rPr>
-          <w:b/>
-        </w:rPr>
-        <w:t>Captación limitada:</w:t>
-      </w:r>
-      <w:r>
-        <w:t xml:space="preserve"> depende del tráfico a pie; poca coordinación entre marketing digital y presencia física.</w:t>
-      </w:r>
-    </w:p>
-    <w:p>
-      <w:pPr>
-        <w:pStyle w:val="Heading2"/>
-      </w:pPr>
-      <w:r>
-        <w:t>Para el ecosistema</w:t>
-      </w:r>
-    </w:p>
-    <w:p>
-      <w:r>
-        <w:t xml:space="preserve">La receta médica venezolana sigue siendo física y vulnerable a errores. Zonix digitaliza la </w:t>
-      </w:r>
-      <w:r>
-        <w:rPr>
-          <w:b/>
-        </w:rPr>
-        <w:t>validación</w:t>
-      </w:r>
-      <w:r>
-        <w:t xml:space="preserve"> con el farmacéutico colegiado de cada farmacia — no sustituye al criterio médico ni al titular de la farmacia.</w:t>
-      </w:r>
-    </w:p>
-    <w:p>
-      <w:r>
-        <w:t>────────────────────────────────────────</w:t>
-      </w:r>
-    </w:p>
-    <w:p>
-      <w:pPr>
-        <w:pStyle w:val="Heading1"/>
-      </w:pPr>
-      <w:r>
-        <w:t>Por qué ahora (timing)</w:t>
-      </w:r>
-    </w:p>
-    <w:p>
-      <w:r>
-        <w:t xml:space="preserve">1. </w:t>
-      </w:r>
-      <w:r>
-        <w:rPr>
-          <w:b/>
-        </w:rPr>
-        <w:t>Mercado pharma VE en recuperación:</w:t>
-      </w:r>
-      <w:r>
-        <w:t xml:space="preserve"> +17,49% YoY en unidades 2024-2025 (Cifar, IMS/IQVIA). </w:t>
-      </w:r>
-      <w:r>
-        <w:rPr>
-          <w:b/>
-        </w:rPr>
-        <w:t>2026 es la ventana</w:t>
-      </w:r>
-      <w:r>
-        <w:t xml:space="preserve"> antes de que competidores digitales cubran independientes.</w:t>
-      </w:r>
-    </w:p>
-    <w:p>
-      <w:r>
-        <w:t xml:space="preserve">2. </w:t>
-      </w:r>
-      <w:r>
-        <w:rPr>
-          <w:b/>
-        </w:rPr>
-        <w:t>Plataforma ya construida:</w:t>
-      </w:r>
-      <w:r>
-        <w:t xml:space="preserve"> ~4 años de desarrollo; fork al vertical farmacia ya invertido — Fase 0 = 90 días de legal, equipo, onboarding y release en tiendas.</w:t>
-      </w:r>
-    </w:p>
-    <w:p>
-      <w:r>
-        <w:t xml:space="preserve">3. </w:t>
-      </w:r>
-      <w:r>
-        <w:rPr>
-          <w:b/>
-        </w:rPr>
-        <w:t>Competencia digital débil en independientes:</w:t>
-      </w:r>
-      <w:r>
-        <w:t xml:space="preserve"> PedidosYa cubre marketplace generalista; Farmatodo y Locatel no abren marketplace B2B a terceros.</w:t>
-      </w:r>
-    </w:p>
-    <w:p>
-      <w:r>
-        <w:t xml:space="preserve">4. </w:t>
-      </w:r>
-      <w:r>
-        <w:rPr>
-          <w:b/>
-        </w:rPr>
-        <w:t>Pagos VE maduros:</w:t>
-      </w:r>
-      <w:r>
-        <w:t xml:space="preserve"> Pago Móvil, Zelle y Binance Pay cubren la población bancarizada.</w:t>
-      </w:r>
-    </w:p>
-    <w:p>
-      <w:r/>
-      <w:r>
-        <w:rPr>
-          <w:b/>
-        </w:rPr>
-        <w:t>Riesgo de timing:</w:t>
-      </w:r>
-      <w:r>
-        <w:t xml:space="preserve"> si esperamos 18 meses, PedidosYa puede mejorar condiciones a cadenas medianas y cerrar el espacio. No es urgencia artificial — es </w:t>
-      </w:r>
-      <w:r>
-        <w:rPr>
-          <w:b/>
-        </w:rPr>
-        <w:t>ventana competitiva</w:t>
-      </w:r>
-      <w:r>
-        <w:t xml:space="preserve"> documentada.</w:t>
-      </w:r>
-    </w:p>
-    <w:p>
-      <w:r>
-        <w:t>────────────────────────────────────────</w:t>
-      </w:r>
-    </w:p>
-    <w:p>
-      <w:pPr>
-        <w:pStyle w:val="Heading1"/>
-      </w:pPr>
-      <w:r>
-        <w:t>Diferenciadores claros</w:t>
-      </w:r>
-    </w:p>
-    <w:p>
-      <w:r>
-        <w:t xml:space="preserve">- </w:t>
-      </w:r>
-      <w:r>
-        <w:rPr>
-          <w:b/>
-        </w:rPr>
-        <w:t>Modelo B2B híbrido en USD</w:t>
-      </w:r>
-      <w:r>
-        <w:t xml:space="preserve"> (cuota </w:t>
-      </w:r>
-      <w:r>
-        <w:rPr>
-          <w:b/>
-        </w:rPr>
-        <w:t>25 / 40 / 55</w:t>
-      </w:r>
-      <w:r>
-        <w:t xml:space="preserve"> + % moderado sobre ventas en app): estructuralmente muy por debajo de la comisión </w:t>
-      </w:r>
-      <w:r>
-        <w:rPr>
-          <w:b/>
-        </w:rPr>
-        <w:t>20–30%</w:t>
-      </w:r>
-      <w:r>
-        <w:t xml:space="preserve"> típica de PedidosYa en VE.</w:t>
-      </w:r>
-    </w:p>
-    <w:p>
-      <w:r>
-        <w:t xml:space="preserve">- </w:t>
-      </w:r>
-      <w:r>
-        <w:rPr>
-          <w:b/>
-        </w:rPr>
-        <w:t>Validación de receta por farmacéutico colegiado de la propia farmacia</w:t>
-      </w:r>
-      <w:r>
-        <w:t xml:space="preserve"> dentro de la app — alineado a regulación VE *(dictamen abogado + farmacéutico asesor pendiente pre-Day-D)*.</w:t>
-      </w:r>
-    </w:p>
-    <w:p>
-      <w:r>
-        <w:t xml:space="preserve">- </w:t>
-      </w:r>
-      <w:r>
-        <w:rPr>
-          <w:b/>
-        </w:rPr>
-        <w:t>Pagos manuales VE nativos:</w:t>
-      </w:r>
-      <w:r>
-        <w:t xml:space="preserve"> Pago Móvil, transferencia, Zelle, Binance Pay — sin pasarelas internacionales caras.</w:t>
-      </w:r>
-    </w:p>
-    <w:p>
-      <w:r>
-        <w:t xml:space="preserve">- </w:t>
-      </w:r>
-      <w:r>
-        <w:rPr>
-          <w:b/>
-        </w:rPr>
-        <w:t>Plataforma en entorno de prueba:</w:t>
-      </w:r>
-      <w:r>
-        <w:t xml:space="preserve"> backend con </w:t>
-      </w:r>
-      <w:r>
-        <w:rPr>
-          <w:b/>
-        </w:rPr>
-        <w:t>443 pruebas</w:t>
-      </w:r>
-      <w:r>
-        <w:t>; notificaciones en tiempo real integradas. Release tiendas + SMS: hitos Fase 0 semanas 7–12.</w:t>
-      </w:r>
-    </w:p>
-    <w:p>
-      <w:r>
-        <w:t xml:space="preserve">- </w:t>
-      </w:r>
-      <w:r>
-        <w:rPr>
-          <w:b/>
-        </w:rPr>
-        <w:t>Equipo lean:</w:t>
-      </w:r>
-      <w:r>
-        <w:t xml:space="preserve"> </w:t>
-      </w:r>
-      <w:r>
-        <w:rPr>
-          <w:b/>
-        </w:rPr>
-        <w:t>4 vendedores comerciales</w:t>
-      </w:r>
-      <w:r>
-        <w:t xml:space="preserve"> + desarrollador junior en nómina en tier </w:t>
-      </w:r>
-      <w:r>
-        <w:rPr>
-          <w:b/>
-        </w:rPr>
-        <w:t>Lean ~112k</w:t>
-      </w:r>
-      <w:r>
-        <w:t xml:space="preserve">. Runway </w:t>
-      </w:r>
-      <w:r>
-        <w:rPr>
-          <w:b/>
-        </w:rPr>
-        <w:t>12 meses</w:t>
-      </w:r>
-      <w:r>
-        <w:t xml:space="preserve"> post-Day-D.</w:t>
-      </w:r>
-    </w:p>
-    <w:p>
-      <w:pPr>
-        <w:pStyle w:val="Heading2"/>
-      </w:pPr>
-      <w:r>
-        <w:t>Liquidez y defensibilidad</w:t>
-      </w:r>
-    </w:p>
-    <w:p>
-      <w:r>
-        <w:t xml:space="preserve">- </w:t>
-      </w:r>
-      <w:r>
-        <w:rPr>
-          <w:b/>
-        </w:rPr>
-        <w:t>Oferta primero:</w:t>
-      </w:r>
-      <w:r>
-        <w:t xml:space="preserve"> 4 vendedores + catálogo en farmacias piloto </w:t>
-      </w:r>
-      <w:r>
-        <w:rPr>
-          <w:b/>
-        </w:rPr>
-        <w:t>antes</w:t>
-      </w:r>
-      <w:r>
-        <w:t xml:space="preserve"> de tráfico masivo a pacientes; </w:t>
-      </w:r>
-      <w:r>
-        <w:rPr>
-          <w:b/>
-        </w:rPr>
-        <w:t>~40 activas</w:t>
-      </w:r>
-      <w:r>
-        <w:t xml:space="preserve"> en M1.</w:t>
-      </w:r>
-    </w:p>
-    <w:p>
-      <w:r>
-        <w:t xml:space="preserve">- </w:t>
-      </w:r>
-      <w:r>
-        <w:rPr>
-          <w:b/>
-        </w:rPr>
-        <w:t>Ventaja operativa:</w:t>
-      </w:r>
-      <w:r>
-        <w:t xml:space="preserve"> receta digital por farmacéutico de </w:t>
-      </w:r>
-      <w:r>
-        <w:rPr>
-          <w:b/>
-        </w:rPr>
-        <w:t>cada</w:t>
-      </w:r>
-      <w:r>
-        <w:t xml:space="preserve"> farmacia + </w:t>
-      </w:r>
-      <w:r>
-        <w:rPr>
-          <w:b/>
-        </w:rPr>
-        <w:t>costo de cambio</w:t>
-      </w:r>
-      <w:r>
-        <w:t xml:space="preserve"> (catálogo, historial, contrato híbrido) + pagos VE nativos.</w:t>
-      </w:r>
-    </w:p>
-    <w:p>
-      <w:r>
-        <w:t xml:space="preserve">- </w:t>
-      </w:r>
-      <w:r>
-        <w:rPr>
-          <w:b/>
-        </w:rPr>
-        <w:t>Efecto red:</w:t>
-      </w:r>
-      <w:r>
-        <w:t xml:space="preserve"> más farmacias → más pacientes → más ventas en app → más reinversión comercial. Cuatro actores: farmacia, paciente, delivery, farmacéutico.</w:t>
-      </w:r>
-    </w:p>
-    <w:p>
-      <w:r>
-        <w:t>────────────────────────────────────────</w:t>
-      </w:r>
-    </w:p>
-    <w:p>
-      <w:pPr>
-        <w:pStyle w:val="Heading1"/>
-      </w:pPr>
-      <w:r>
-        <w:t>Mercado y oportunidad</w:t>
+        <w:t>Equipo piloto Lean (237.412 — tabla burn) — resumen</w:t>
       </w:r>
     </w:p>
     <w:tbl>
@@ -967,13 +970,15 @@
         <w:tblLook w:firstColumn="1" w:firstRow="1" w:lastColumn="0" w:lastRow="0" w:noHBand="0" w:noVBand="1" w:val="04A0"/>
       </w:tblPr>
       <w:tblGrid>
-        <w:gridCol w:w="4320"/>
-        <w:gridCol w:w="4320"/>
+        <w:gridCol w:w="2160"/>
+        <w:gridCol w:w="2160"/>
+        <w:gridCol w:w="2160"/>
+        <w:gridCol w:w="2160"/>
       </w:tblGrid>
       <w:tr>
         <w:tc>
           <w:tcPr>
-            <w:tcW w:type="dxa" w:w="4320"/>
+            <w:tcW w:type="dxa" w:w="2160"/>
             <w:shd w:fill="1E2A5A"/>
           </w:tcPr>
           <w:p>
@@ -983,13 +988,13 @@
                 <w:color w:val="FFFFFF"/>
                 <w:sz w:val="20"/>
               </w:rPr>
-              <w:t>Concepto</w:t>
+              <w:t>Rol</w:t>
             </w:r>
           </w:p>
         </w:tc>
         <w:tc>
           <w:tcPr>
-            <w:tcW w:type="dxa" w:w="4320"/>
+            <w:tcW w:type="dxa" w:w="2160"/>
             <w:shd w:fill="1E2A5A"/>
           </w:tcPr>
           <w:p>
@@ -999,7 +1004,39 @@
                 <w:color w:val="FFFFFF"/>
                 <w:sz w:val="20"/>
               </w:rPr>
-              <w:t>Valor</w:t>
+              <w:t>Tipo</w:t>
+            </w:r>
+          </w:p>
+        </w:tc>
+        <w:tc>
+          <w:tcPr>
+            <w:tcW w:type="dxa" w:w="2160"/>
+            <w:shd w:fill="1E2A5A"/>
+          </w:tcPr>
+          <w:p>
+            <w:r>
+              <w:rPr>
+                <w:b/>
+                <w:color w:val="FFFFFF"/>
+                <w:sz w:val="20"/>
+              </w:rPr>
+              <w:t>Compensación ref. (USD/mes)</w:t>
+            </w:r>
+          </w:p>
+        </w:tc>
+        <w:tc>
+          <w:tcPr>
+            <w:tcW w:type="dxa" w:w="2160"/>
+            <w:shd w:fill="1E2A5A"/>
+          </w:tcPr>
+          <w:p>
+            <w:r>
+              <w:rPr>
+                <w:b/>
+                <w:color w:val="FFFFFF"/>
+                <w:sz w:val="20"/>
+              </w:rPr>
+              <w:t>Notas</w:t>
             </w:r>
           </w:p>
         </w:tc>
@@ -1007,27 +1044,53 @@
       <w:tr>
         <w:tc>
           <w:tcPr>
-            <w:tcW w:type="dxa" w:w="4320"/>
+            <w:tcW w:type="dxa" w:w="2160"/>
           </w:tcPr>
           <w:p>
             <w:r>
               <w:rPr>
                 <w:sz w:val="20"/>
               </w:rPr>
-              <w:t>**TAM Venezuela**</w:t>
+              <w:t>CEO</w:t>
             </w:r>
           </w:p>
         </w:tc>
         <w:tc>
           <w:tcPr>
-            <w:tcW w:type="dxa" w:w="4320"/>
+            <w:tcW w:type="dxa" w:w="2160"/>
           </w:tcPr>
           <w:p>
             <w:r>
               <w:rPr>
                 <w:sz w:val="20"/>
               </w:rPr>
-              <w:t>USD **1.638M/año** (389M unidades × USD 4,21; Cifar / IMS-IQVIA 2025). +17,49% YoY unidades</w:t>
+              <w:t>FTE</w:t>
+            </w:r>
+          </w:p>
+        </w:tc>
+        <w:tc>
+          <w:tcPr>
+            <w:tcW w:type="dxa" w:w="2160"/>
+          </w:tcPr>
+          <w:p>
+            <w:r>
+              <w:rPr>
+                <w:sz w:val="20"/>
+              </w:rPr>
+              <w:t>**1.000**</w:t>
+            </w:r>
+          </w:p>
+        </w:tc>
+        <w:tc>
+          <w:tcPr>
+            <w:tcW w:type="dxa" w:w="2160"/>
+          </w:tcPr>
+          <w:p>
+            <w:r>
+              <w:rPr>
+                <w:sz w:val="20"/>
+              </w:rPr>
+              <w:t>Dirección general (rol adicional v4)</w:t>
             </w:r>
           </w:p>
         </w:tc>
@@ -1035,27 +1098,53 @@
       <w:tr>
         <w:tc>
           <w:tcPr>
-            <w:tcW w:type="dxa" w:w="4320"/>
+            <w:tcW w:type="dxa" w:w="2160"/>
           </w:tcPr>
           <w:p>
             <w:r>
               <w:rPr>
                 <w:sz w:val="20"/>
               </w:rPr>
-              <w:t>**TAM regional Carabobo**</w:t>
+              <w:t>Founder / CEO / CTO</w:t>
             </w:r>
           </w:p>
         </w:tc>
         <w:tc>
           <w:tcPr>
-            <w:tcW w:type="dxa" w:w="4320"/>
+            <w:tcW w:type="dxa" w:w="2160"/>
           </w:tcPr>
           <w:p>
             <w:r>
               <w:rPr>
                 <w:sz w:val="20"/>
               </w:rPr>
-              <w:t>~350–450 farmacias (**226** solo Valencia metro)</w:t>
+              <w:t>FTE</w:t>
+            </w:r>
+          </w:p>
+        </w:tc>
+        <w:tc>
+          <w:tcPr>
+            <w:tcW w:type="dxa" w:w="2160"/>
+          </w:tcPr>
+          <w:p>
+            <w:r>
+              <w:rPr>
+                <w:sz w:val="20"/>
+              </w:rPr>
+              <w:t>**1.000**</w:t>
+            </w:r>
+          </w:p>
+        </w:tc>
+        <w:tc>
+          <w:tcPr>
+            <w:tcW w:type="dxa" w:w="2160"/>
+          </w:tcPr>
+          <w:p>
+            <w:r>
+              <w:rPr>
+                <w:sz w:val="20"/>
+              </w:rPr>
+              <w:t>Abrahan Pulido — producto + tech</w:t>
             </w:r>
           </w:p>
         </w:tc>
@@ -1063,27 +1152,53 @@
       <w:tr>
         <w:tc>
           <w:tcPr>
-            <w:tcW w:type="dxa" w:w="4320"/>
+            <w:tcW w:type="dxa" w:w="2160"/>
           </w:tcPr>
           <w:p>
             <w:r>
               <w:rPr>
                 <w:sz w:val="20"/>
               </w:rPr>
-              <w:t>**SAM zona piloto**</w:t>
+              <w:t>Co-CEO / Head Sales&amp;Ops</w:t>
             </w:r>
           </w:p>
         </w:tc>
         <w:tc>
           <w:tcPr>
-            <w:tcW w:type="dxa" w:w="4320"/>
+            <w:tcW w:type="dxa" w:w="2160"/>
           </w:tcPr>
           <w:p>
             <w:r>
               <w:rPr>
                 <w:sz w:val="20"/>
               </w:rPr>
-              <w:t>30–50 farmacias primer trimestre; foco Bella Florida + El Socorro</w:t>
+              <w:t>FTE</w:t>
+            </w:r>
+          </w:p>
+        </w:tc>
+        <w:tc>
+          <w:tcPr>
+            <w:tcW w:type="dxa" w:w="2160"/>
+          </w:tcPr>
+          <w:p>
+            <w:r>
+              <w:rPr>
+                <w:sz w:val="20"/>
+              </w:rPr>
+              <w:t>**1.000**</w:t>
+            </w:r>
+          </w:p>
+        </w:tc>
+        <w:tc>
+          <w:tcPr>
+            <w:tcW w:type="dxa" w:w="2160"/>
+          </w:tcPr>
+          <w:p>
+            <w:r>
+              <w:rPr>
+                <w:sz w:val="20"/>
+              </w:rPr>
+              <w:t>Comercial / operación / corporate</w:t>
             </w:r>
           </w:p>
         </w:tc>
@@ -1091,27 +1206,269 @@
       <w:tr>
         <w:tc>
           <w:tcPr>
-            <w:tcW w:type="dxa" w:w="4320"/>
+            <w:tcW w:type="dxa" w:w="2160"/>
           </w:tcPr>
           <w:p>
             <w:r>
               <w:rPr>
                 <w:sz w:val="20"/>
               </w:rPr>
-              <w:t>**SOM M12**</w:t>
+              <w:t>**Dev (Flutter/Laravel)**</w:t>
             </w:r>
           </w:p>
         </w:tc>
         <w:tc>
           <w:tcPr>
-            <w:tcW w:type="dxa" w:w="4320"/>
+            <w:tcW w:type="dxa" w:w="2160"/>
           </w:tcPr>
           <w:p>
             <w:r>
               <w:rPr>
                 <w:sz w:val="20"/>
               </w:rPr>
-              <w:t>**~159 farmacias activas** (caso central Lean). Casi equilibrio mensual M12 con ingreso medio **~50** *(placeholder)*</w:t>
+              <w:t>FTE</w:t>
+            </w:r>
+          </w:p>
+        </w:tc>
+        <w:tc>
+          <w:tcPr>
+            <w:tcW w:type="dxa" w:w="2160"/>
+          </w:tcPr>
+          <w:p>
+            <w:r>
+              <w:rPr>
+                <w:sz w:val="20"/>
+              </w:rPr>
+              <w:t>**1.000**</w:t>
+            </w:r>
+          </w:p>
+        </w:tc>
+        <w:tc>
+          <w:tcPr>
+            <w:tcW w:type="dxa" w:w="2160"/>
+          </w:tcPr>
+          <w:p>
+            <w:r>
+              <w:rPr>
+                <w:sz w:val="20"/>
+              </w:rPr>
+              <w:t>Celda lean **1.000**; nota esc.1 «Dev x2 @ 1.000» = mismo tope de línea (no 2k) — PRESUPUESTO §1.1</w:t>
+            </w:r>
+          </w:p>
+        </w:tc>
+      </w:tr>
+      <w:tr>
+        <w:tc>
+          <w:tcPr>
+            <w:tcW w:type="dxa" w:w="2160"/>
+          </w:tcPr>
+          <w:p>
+            <w:r>
+              <w:rPr>
+                <w:sz w:val="20"/>
+              </w:rPr>
+              <w:t>Sales B2B (**×4**)</w:t>
+            </w:r>
+          </w:p>
+        </w:tc>
+        <w:tc>
+          <w:tcPr>
+            <w:tcW w:type="dxa" w:w="2160"/>
+          </w:tcPr>
+          <w:p>
+            <w:r>
+              <w:rPr>
+                <w:sz w:val="20"/>
+              </w:rPr>
+              <w:t>FTE</w:t>
+            </w:r>
+          </w:p>
+        </w:tc>
+        <w:tc>
+          <w:tcPr>
+            <w:tcW w:type="dxa" w:w="2160"/>
+          </w:tcPr>
+          <w:p>
+            <w:r>
+              <w:rPr>
+                <w:sz w:val="20"/>
+              </w:rPr>
+              <w:t>**350** base + **40**/firma</w:t>
+            </w:r>
+          </w:p>
+        </w:tc>
+        <w:tc>
+          <w:tcPr>
+            <w:tcW w:type="dxa" w:w="2160"/>
+          </w:tcPr>
+          <w:p>
+            <w:r>
+              <w:rPr>
+                <w:sz w:val="20"/>
+              </w:rPr>
+              <w:t>Comisión a rep que cierra</w:t>
+            </w:r>
+          </w:p>
+        </w:tc>
+      </w:tr>
+      <w:tr>
+        <w:tc>
+          <w:tcPr>
+            <w:tcW w:type="dxa" w:w="2160"/>
+          </w:tcPr>
+          <w:p>
+            <w:r>
+              <w:rPr>
+                <w:sz w:val="20"/>
+              </w:rPr>
+              <w:t>Customer Support + Community Manager</w:t>
+            </w:r>
+          </w:p>
+        </w:tc>
+        <w:tc>
+          <w:tcPr>
+            <w:tcW w:type="dxa" w:w="2160"/>
+          </w:tcPr>
+          <w:p>
+            <w:r>
+              <w:rPr>
+                <w:sz w:val="20"/>
+              </w:rPr>
+              <w:t>FTE</w:t>
+            </w:r>
+          </w:p>
+        </w:tc>
+        <w:tc>
+          <w:tcPr>
+            <w:tcW w:type="dxa" w:w="2160"/>
+          </w:tcPr>
+          <w:p>
+            <w:r>
+              <w:rPr>
+                <w:sz w:val="20"/>
+              </w:rPr>
+              <w:t>**500**</w:t>
+            </w:r>
+          </w:p>
+        </w:tc>
+        <w:tc>
+          <w:tcPr>
+            <w:tcW w:type="dxa" w:w="2160"/>
+          </w:tcPr>
+          <w:p>
+            <w:r>
+              <w:rPr>
+                <w:sz w:val="20"/>
+              </w:rPr>
+              <w:t>Soporte + comunidad</w:t>
+            </w:r>
+          </w:p>
+        </w:tc>
+      </w:tr>
+      <w:tr>
+        <w:tc>
+          <w:tcPr>
+            <w:tcW w:type="dxa" w:w="2160"/>
+          </w:tcPr>
+          <w:p>
+            <w:r>
+              <w:rPr>
+                <w:sz w:val="20"/>
+              </w:rPr>
+              <w:t>Contador + Abogado (+ asesor Rx)</w:t>
+            </w:r>
+          </w:p>
+        </w:tc>
+        <w:tc>
+          <w:tcPr>
+            <w:tcW w:type="dxa" w:w="2160"/>
+          </w:tcPr>
+          <w:p>
+            <w:r>
+              <w:rPr>
+                <w:sz w:val="20"/>
+              </w:rPr>
+              <w:t>Freelance</w:t>
+            </w:r>
+          </w:p>
+        </w:tc>
+        <w:tc>
+          <w:tcPr>
+            <w:tcW w:type="dxa" w:w="2160"/>
+          </w:tcPr>
+          <w:p>
+            <w:r>
+              <w:rPr>
+                <w:sz w:val="20"/>
+              </w:rPr>
+              <w:t>**330**</w:t>
+            </w:r>
+          </w:p>
+        </w:tc>
+        <w:tc>
+          <w:tcPr>
+            <w:tcW w:type="dxa" w:w="2160"/>
+          </w:tcPr>
+          <w:p>
+            <w:r>
+              <w:rPr>
+                <w:sz w:val="20"/>
+              </w:rPr>
+              <w:t>Incluye asesor regulatorio farmacéutico **120** (PRESUPUESTO: una sola fila 330)</w:t>
+            </w:r>
+          </w:p>
+        </w:tc>
+      </w:tr>
+      <w:tr>
+        <w:tc>
+          <w:tcPr>
+            <w:tcW w:type="dxa" w:w="2160"/>
+          </w:tcPr>
+          <w:p>
+            <w:r>
+              <w:rPr>
+                <w:sz w:val="20"/>
+              </w:rPr>
+              <w:t>Herramientas IA</w:t>
+            </w:r>
+          </w:p>
+        </w:tc>
+        <w:tc>
+          <w:tcPr>
+            <w:tcW w:type="dxa" w:w="2160"/>
+          </w:tcPr>
+          <w:p>
+            <w:r>
+              <w:rPr>
+                <w:sz w:val="20"/>
+              </w:rPr>
+              <w:t>Opex</w:t>
+            </w:r>
+          </w:p>
+        </w:tc>
+        <w:tc>
+          <w:tcPr>
+            <w:tcW w:type="dxa" w:w="2160"/>
+          </w:tcPr>
+          <w:p>
+            <w:r>
+              <w:rPr>
+                <w:sz w:val="20"/>
+              </w:rPr>
+              <w:t>**425**</w:t>
+            </w:r>
+          </w:p>
+        </w:tc>
+        <w:tc>
+          <w:tcPr>
+            <w:tcW w:type="dxa" w:w="2160"/>
+          </w:tcPr>
+          <w:p>
+            <w:r>
+              <w:rPr>
+                <w:sz w:val="20"/>
+              </w:rPr>
+              <w:t>Stack productividad</w:t>
             </w:r>
           </w:p>
         </w:tc>
@@ -1119,11 +1476,200 @@
     </w:tbl>
     <w:p/>
     <w:p>
+      <w:r>
+        <w:rPr>
+          <w:i/>
+        </w:rPr>
+        <w:t>Detalle burn y equipo: [MODELO_FINANCIERO_ZONIX_PHARMA.md](MODELO_FINANCIERO_ZONIX_PHARMA.md) S1.2b, S3.2.</w:t>
+      </w:r>
+    </w:p>
+    <w:p>
+      <w:pPr>
+        <w:pStyle w:val="Heading1"/>
+      </w:pPr>
+      <w:r>
+        <w:t>Mercado y oportunidad (validados)</w:t>
+      </w:r>
+    </w:p>
+    <w:p>
+      <w:r>
+        <w:t xml:space="preserve">- </w:t>
+      </w:r>
+      <w:r>
+        <w:rPr>
+          <w:b/>
+        </w:rPr>
+        <w:t>TAM Venezuela:</w:t>
+      </w:r>
+      <w:r>
+        <w:t xml:space="preserve"> USD 1.638M/año (389M unidades × USD 4,21 promedio, fuente </w:t>
+      </w:r>
+      <w:r>
+        <w:rPr>
+          <w:b/>
+        </w:rPr>
+        <w:t>Cifar VE</w:t>
+      </w:r>
+      <w:r>
+        <w:t xml:space="preserve">, datos </w:t>
+      </w:r>
+      <w:r>
+        <w:rPr>
+          <w:b/>
+        </w:rPr>
+        <w:t>IMS/IQVIA</w:t>
+      </w:r>
+      <w:r>
+        <w:t xml:space="preserve"> 2025). Crecimiento +17,49% YoY en unidades. CAGR 6,1% proyectado 2026-2032.</w:t>
+      </w:r>
+    </w:p>
+    <w:p>
+      <w:r>
+        <w:t xml:space="preserve">- </w:t>
+      </w:r>
+      <w:r>
+        <w:rPr>
+          <w:b/>
+        </w:rPr>
+        <w:t>TAM regional Carabobo:</w:t>
+      </w:r>
+      <w:r>
+        <w:t xml:space="preserve"> ~350-450 farmacias (226 solo en Valencia metro, [Farmacias Saas](https://www.saasvenezuela.com/sucursales) y directorios públicos).</w:t>
+      </w:r>
+    </w:p>
+    <w:p>
+      <w:r>
+        <w:t xml:space="preserve">- </w:t>
+      </w:r>
+      <w:r>
+        <w:rPr>
+          <w:b/>
+        </w:rPr>
+        <w:t>SAM zona piloto (Valencia metro):</w:t>
+      </w:r>
+      <w:r>
+        <w:t xml:space="preserve"> 30-50 farmacias primer trimestre operativo; foco HQ </w:t>
+      </w:r>
+      <w:r>
+        <w:rPr>
+          <w:b/>
+        </w:rPr>
+        <w:t>San Diego / Av. Bolívar Norte</w:t>
+      </w:r>
+      <w:r>
+        <w:t xml:space="preserve"> (ver [PLAN_LANZAMIENTO_COMERCIAL.md](PLAN_LANZAMIENTO_COMERCIAL.md)).</w:t>
+      </w:r>
+    </w:p>
+    <w:p>
+      <w:r>
+        <w:t xml:space="preserve">- </w:t>
+      </w:r>
+      <w:r>
+        <w:rPr>
+          <w:b/>
+        </w:rPr>
+        <w:t>SOM / cierre año 1 (M12 post-Day-D):</w:t>
+      </w:r>
+      <w:r>
+        <w:t xml:space="preserve"> </w:t>
+      </w:r>
+      <w:r>
+        <w:rPr>
+          <w:b/>
+        </w:rPr>
+        <w:t>~159 farmacias activas</w:t>
+      </w:r>
+      <w:r>
+        <w:t xml:space="preserve"> en el caso central Lean ([MODELO_FINANCIERO_ZONIX_PHARMA.md](MODELO_FINANCIERO_ZONIX_PHARMA.md) S3.1). Con </w:t>
+      </w:r>
+      <w:r>
+        <w:rPr>
+          <w:b/>
+        </w:rPr>
+        <w:t>4× Sales</w:t>
+      </w:r>
+      <w:r>
+        <w:t xml:space="preserve">, modelo </w:t>
+      </w:r>
+      <w:r>
+        <w:rPr>
+          <w:b/>
+        </w:rPr>
+        <w:t>híbrido</w:t>
+      </w:r>
+      <w:r>
+        <w:t xml:space="preserve"> (pricing </w:t>
+      </w:r>
+      <w:r>
+        <w:rPr>
+          <w:b/>
+        </w:rPr>
+        <w:t>45/60/70</w:t>
+      </w:r>
+      <w:r>
+        <w:t xml:space="preserve"> + % GMV) y </w:t>
+      </w:r>
+      <w:r>
+        <w:rPr>
+          <w:b/>
+        </w:rPr>
+        <w:t>ARPF ~52</w:t>
+      </w:r>
+      <w:r>
+        <w:t xml:space="preserve"> _(placeholder)_, equilibrio FCF mensual desde </w:t>
+      </w:r>
+      <w:r>
+        <w:rPr>
+          <w:b/>
+        </w:rPr>
+        <w:t>M5</w:t>
+      </w:r>
+      <w:r>
+        <w:t xml:space="preserve"> (FCF M1–M4 negativo; ingresos M1 </w:t>
+      </w:r>
+      <w:r>
+        <w:rPr>
+          <w:b/>
+        </w:rPr>
+        <w:t>7.520</w:t>
+      </w:r>
+      <w:r>
+        <w:t xml:space="preserve"> &lt; costos </w:t>
+      </w:r>
+      <w:r>
+        <w:rPr>
+          <w:b/>
+        </w:rPr>
+        <w:t>11.411</w:t>
+      </w:r>
+      <w:r>
+        <w:t xml:space="preserve">); FCF Y1 </w:t>
+      </w:r>
+      <w:r>
+        <w:rPr>
+          <w:b/>
+        </w:rPr>
+        <w:t>+59.079</w:t>
+      </w:r>
+      <w:r>
+        <w:t xml:space="preserve">; cash M12 </w:t>
+      </w:r>
+      <w:r>
+        <w:rPr>
+          <w:b/>
+        </w:rPr>
+        <w:t>246.231</w:t>
+      </w:r>
+      <w:r>
+        <w:t>.</w:t>
+      </w:r>
+    </w:p>
+    <w:p>
       <w:pPr>
         <w:pStyle w:val="Heading2"/>
       </w:pPr>
       <w:r>
-        <w:t>Tiers de capital (referencia)</w:t>
+        <w:t>Tier vigente (Lean Excel v4 — ask único)</w:t>
       </w:r>
     </w:p>
     <w:tbl>
@@ -1214,7 +1760,7 @@
               <w:rPr>
                 <w:sz w:val="20"/>
               </w:rPr>
-              <w:t>**Lean ~112k**</w:t>
+              <w:t>**Lean 237.412** _(v4 Excel — ask único)_</w:t>
             </w:r>
           </w:p>
         </w:tc>
@@ -1227,7 +1773,7 @@
               <w:rPr>
                 <w:sz w:val="20"/>
               </w:rPr>
-              <w:t>**~USD 112k**</w:t>
+              <w:t>**USD 237.412**</w:t>
             </w:r>
           </w:p>
         </w:tc>
@@ -1240,7 +1786,7 @@
               <w:rPr>
                 <w:sz w:val="20"/>
               </w:rPr>
-              <w:t>4 vendedores @ 350</w:t>
+              <w:t>**4× Sales @ 350** + equipo tabla burn</w:t>
             </w:r>
           </w:p>
         </w:tc>
@@ -1253,115 +1799,7 @@
               <w:rPr>
                 <w:sz w:val="20"/>
               </w:rPr>
-              <w:t>Bootstrap Carabobo</w:t>
-            </w:r>
-          </w:p>
-        </w:tc>
-      </w:tr>
-      <w:tr>
-        <w:tc>
-          <w:tcPr>
-            <w:tcW w:type="dxa" w:w="2160"/>
-          </w:tcPr>
-          <w:p>
-            <w:r>
-              <w:rPr>
-                <w:sz w:val="20"/>
-              </w:rPr>
-              <w:t>**Base ~157k**</w:t>
-            </w:r>
-          </w:p>
-        </w:tc>
-        <w:tc>
-          <w:tcPr>
-            <w:tcW w:type="dxa" w:w="2160"/>
-          </w:tcPr>
-          <w:p>
-            <w:r>
-              <w:rPr>
-                <w:sz w:val="20"/>
-              </w:rPr>
-              <w:t>**~USD 157k**</w:t>
-            </w:r>
-          </w:p>
-        </w:tc>
-        <w:tc>
-          <w:tcPr>
-            <w:tcW w:type="dxa" w:w="2160"/>
-          </w:tcPr>
-          <w:p>
-            <w:r>
-              <w:rPr>
-                <w:sz w:val="20"/>
-              </w:rPr>
-              <w:t>4 vendedores @ 400</w:t>
-            </w:r>
-          </w:p>
-        </w:tc>
-        <w:tc>
-          <w:tcPr>
-            <w:tcW w:type="dxa" w:w="2160"/>
-          </w:tcPr>
-          <w:p>
-            <w:r>
-              <w:rPr>
-                <w:sz w:val="20"/>
-              </w:rPr>
-              <w:t>Sueldos mercado + reserva</w:t>
-            </w:r>
-          </w:p>
-        </w:tc>
-      </w:tr>
-      <w:tr>
-        <w:tc>
-          <w:tcPr>
-            <w:tcW w:type="dxa" w:w="2160"/>
-          </w:tcPr>
-          <w:p>
-            <w:r>
-              <w:rPr>
-                <w:sz w:val="20"/>
-              </w:rPr>
-              <w:t>**Growth ~187k**</w:t>
-            </w:r>
-          </w:p>
-        </w:tc>
-        <w:tc>
-          <w:tcPr>
-            <w:tcW w:type="dxa" w:w="2160"/>
-          </w:tcPr>
-          <w:p>
-            <w:r>
-              <w:rPr>
-                <w:sz w:val="20"/>
-              </w:rPr>
-              <w:t>**~USD 187k**</w:t>
-            </w:r>
-          </w:p>
-        </w:tc>
-        <w:tc>
-          <w:tcPr>
-            <w:tcW w:type="dxa" w:w="2160"/>
-          </w:tcPr>
-          <w:p>
-            <w:r>
-              <w:rPr>
-                <w:sz w:val="20"/>
-              </w:rPr>
-              <w:t>4 vendedores @ 450</w:t>
-            </w:r>
-          </w:p>
-        </w:tc>
-        <w:tc>
-          <w:tcPr>
-            <w:tcW w:type="dxa" w:w="2160"/>
-          </w:tcPr>
-          <w:p>
-            <w:r>
-              <w:rPr>
-                <w:sz w:val="20"/>
-              </w:rPr>
-              <w:t>Dev senior + colchón</w:t>
+              <w:t>Bootstrap Carabobo — Fase 0 **50.260**; burn M1–M12 **172.152**</w:t>
             </w:r>
           </w:p>
         </w:tc>
@@ -1373,12 +1811,7 @@
         <w:rPr>
           <w:i/>
         </w:rPr>
-        <w:t>**Referencia principal:** Lean **~112k**. Censo Carabobo: 226 farmacias Valencia metro documentadas en directorios públicos.</w:t>
-      </w:r>
-    </w:p>
-    <w:p>
-      <w:r>
-        <w:t>────────────────────────────────────────</w:t>
+        <w:t>**Ask único (v4):** **Lean USD 237.412** @ cap **600k** → equity **~39,57%**. Censo: [CENSO_FARMACIAS_CARABOBO_FASE0.md](CENSO_FARMACIAS_CARABOBO_FASE0.md).</w:t>
       </w:r>
     </w:p>
     <w:p>
@@ -1386,7 +1819,19 @@
         <w:pStyle w:val="Heading1"/>
       </w:pPr>
       <w:r>
-        <w:t>Modelo financiero (escenario Lean — ~USD 112k)</w:t>
+        <w:t>Modelo financiero (escenario Lean Excel — USD 237.412)</w:t>
+      </w:r>
+    </w:p>
+    <w:p>
+      <w:r/>
+      <w:r>
+        <w:rPr>
+          <w:b/>
+        </w:rPr>
+        <w:t>Resumen Lean v4</w:t>
+      </w:r>
+      <w:r>
+        <w:t xml:space="preserve"> ([`MODELO_FINANCIERO_ZONIX_PHARMA.xlsx`](MODELO_FINANCIERO_ZONIX_PHARMA.xlsx) sync 7-ago-2026 = Descargas `MODELO_FINANCIERO_040826_v4.xlsx`):</w:t>
       </w:r>
     </w:p>
     <w:tbl>
@@ -1396,15 +1841,13 @@
         <w:tblLook w:firstColumn="1" w:firstRow="1" w:lastColumn="0" w:lastRow="0" w:noHBand="0" w:noVBand="1" w:val="04A0"/>
       </w:tblPr>
       <w:tblGrid>
-        <w:gridCol w:w="2160"/>
-        <w:gridCol w:w="2160"/>
-        <w:gridCol w:w="2160"/>
-        <w:gridCol w:w="2160"/>
+        <w:gridCol w:w="4320"/>
+        <w:gridCol w:w="4320"/>
       </w:tblGrid>
       <w:tr>
         <w:tc>
           <w:tcPr>
-            <w:tcW w:type="dxa" w:w="2160"/>
+            <w:tcW w:type="dxa" w:w="4320"/>
             <w:shd w:fill="1E2A5A"/>
           </w:tcPr>
           <w:p>
@@ -1420,7 +1863,7 @@
         </w:tc>
         <w:tc>
           <w:tcPr>
-            <w:tcW w:type="dxa" w:w="2160"/>
+            <w:tcW w:type="dxa" w:w="4320"/>
             <w:shd w:fill="1E2A5A"/>
           </w:tcPr>
           <w:p>
@@ -1430,39 +1873,7 @@
                 <w:color w:val="FFFFFF"/>
                 <w:sz w:val="20"/>
               </w:rPr>
-              <w:t>Lean (~112k)</w:t>
-            </w:r>
-          </w:p>
-        </w:tc>
-        <w:tc>
-          <w:tcPr>
-            <w:tcW w:type="dxa" w:w="2160"/>
-            <w:shd w:fill="1E2A5A"/>
-          </w:tcPr>
-          <w:p>
-            <w:r>
-              <w:rPr>
-                <w:b/>
-                <w:color w:val="FFFFFF"/>
-                <w:sz w:val="20"/>
-              </w:rPr>
-              <w:t>Base (~157k)</w:t>
-            </w:r>
-          </w:p>
-        </w:tc>
-        <w:tc>
-          <w:tcPr>
-            <w:tcW w:type="dxa" w:w="2160"/>
-            <w:shd w:fill="1E2A5A"/>
-          </w:tcPr>
-          <w:p>
-            <w:r>
-              <w:rPr>
-                <w:b/>
-                <w:color w:val="FFFFFF"/>
-                <w:sz w:val="20"/>
-              </w:rPr>
-              <w:t>Growth (~187k)</w:t>
+              <w:t>Lean v4</w:t>
             </w:r>
           </w:p>
         </w:tc>
@@ -1470,53 +1881,27 @@
       <w:tr>
         <w:tc>
           <w:tcPr>
-            <w:tcW w:type="dxa" w:w="2160"/>
+            <w:tcW w:type="dxa" w:w="4320"/>
           </w:tcPr>
           <w:p>
             <w:r>
               <w:rPr>
                 <w:sz w:val="20"/>
               </w:rPr>
-              <w:t>Capital</w:t>
+              <w:t>Capital pedido (TOTAL SAFE)</w:t>
             </w:r>
           </w:p>
         </w:tc>
         <w:tc>
           <w:tcPr>
-            <w:tcW w:type="dxa" w:w="2160"/>
+            <w:tcW w:type="dxa" w:w="4320"/>
           </w:tcPr>
           <w:p>
             <w:r>
               <w:rPr>
                 <w:sz w:val="20"/>
               </w:rPr>
-              <w:t>**~USD 112k**</w:t>
-            </w:r>
-          </w:p>
-        </w:tc>
-        <w:tc>
-          <w:tcPr>
-            <w:tcW w:type="dxa" w:w="2160"/>
-          </w:tcPr>
-          <w:p>
-            <w:r>
-              <w:rPr>
-                <w:sz w:val="20"/>
-              </w:rPr>
-              <w:t>**~USD 157k**</w:t>
-            </w:r>
-          </w:p>
-        </w:tc>
-        <w:tc>
-          <w:tcPr>
-            <w:tcW w:type="dxa" w:w="2160"/>
-          </w:tcPr>
-          <w:p>
-            <w:r>
-              <w:rPr>
-                <w:sz w:val="20"/>
-              </w:rPr>
-              <w:t>**~USD 187k**</w:t>
+              <w:t>**USD 237.412** _(≈237k)_</w:t>
             </w:r>
           </w:p>
         </w:tc>
@@ -1524,53 +1909,27 @@
       <w:tr>
         <w:tc>
           <w:tcPr>
-            <w:tcW w:type="dxa" w:w="2160"/>
+            <w:tcW w:type="dxa" w:w="4320"/>
           </w:tcPr>
           <w:p>
             <w:r>
               <w:rPr>
                 <w:sz w:val="20"/>
               </w:rPr>
-              <w:t>SAFE cap</w:t>
+              <w:t>SAFE cap ref.</w:t>
             </w:r>
           </w:p>
         </w:tc>
         <w:tc>
           <w:tcPr>
-            <w:tcW w:type="dxa" w:w="2160"/>
+            <w:tcW w:type="dxa" w:w="4320"/>
           </w:tcPr>
           <w:p>
             <w:r>
               <w:rPr>
                 <w:sz w:val="20"/>
               </w:rPr>
-              <w:t>**600.000**</w:t>
-            </w:r>
-          </w:p>
-        </w:tc>
-        <w:tc>
-          <w:tcPr>
-            <w:tcW w:type="dxa" w:w="2160"/>
-          </w:tcPr>
-          <w:p>
-            <w:r>
-              <w:rPr>
-                <w:sz w:val="20"/>
-              </w:rPr>
-              <w:t>**~913k**</w:t>
-            </w:r>
-          </w:p>
-        </w:tc>
-        <w:tc>
-          <w:tcPr>
-            <w:tcW w:type="dxa" w:w="2160"/>
-          </w:tcPr>
-          <w:p>
-            <w:r>
-              <w:rPr>
-                <w:sz w:val="20"/>
-              </w:rPr>
-              <w:t>**~1,2M**</w:t>
+              <w:t>**600.000** → equity **~39,57%**</w:t>
             </w:r>
           </w:p>
         </w:tc>
@@ -1578,59 +1937,265 @@
       <w:tr>
         <w:tc>
           <w:tcPr>
-            <w:tcW w:type="dxa" w:w="2160"/>
+            <w:tcW w:type="dxa" w:w="4320"/>
           </w:tcPr>
           <w:p>
             <w:r>
               <w:rPr>
                 <w:sz w:val="20"/>
               </w:rPr>
-              <w:t>Burn prom. mensual</w:t>
+              <w:t>One-shots (legal+intro+HQ CapEx)</w:t>
             </w:r>
           </w:p>
         </w:tc>
         <w:tc>
           <w:tcPr>
-            <w:tcW w:type="dxa" w:w="2160"/>
+            <w:tcW w:type="dxa" w:w="4320"/>
           </w:tcPr>
           <w:p>
             <w:r>
               <w:rPr>
                 <w:sz w:val="20"/>
               </w:rPr>
-              <w:t>**~8.108**</w:t>
+              <w:t>**USD 22.365**</w:t>
             </w:r>
           </w:p>
         </w:tc>
+      </w:tr>
+      <w:tr>
         <w:tc>
           <w:tcPr>
-            <w:tcW w:type="dxa" w:w="2160"/>
+            <w:tcW w:type="dxa" w:w="4320"/>
           </w:tcPr>
           <w:p>
             <w:r>
               <w:rPr>
                 <w:sz w:val="20"/>
               </w:rPr>
-              <w:t>**~10.898**</w:t>
+              <w:t>Fase 0 operativa (MO+mkt+transporte)</w:t>
             </w:r>
           </w:p>
         </w:tc>
         <w:tc>
           <w:tcPr>
-            <w:tcW w:type="dxa" w:w="2160"/>
+            <w:tcW w:type="dxa" w:w="4320"/>
           </w:tcPr>
           <w:p>
             <w:r>
               <w:rPr>
                 <w:sz w:val="20"/>
               </w:rPr>
-              <w:t>**~12.698**</w:t>
+              <w:t>**USD 27.895**</w:t>
+            </w:r>
+          </w:p>
+        </w:tc>
+      </w:tr>
+      <w:tr>
+        <w:tc>
+          <w:tcPr>
+            <w:tcW w:type="dxa" w:w="4320"/>
+          </w:tcPr>
+          <w:p>
+            <w:r>
+              <w:rPr>
+                <w:sz w:val="20"/>
+              </w:rPr>
+              <w:t>Fase 0 total (T+0→Day-D)</w:t>
+            </w:r>
+          </w:p>
+        </w:tc>
+        <w:tc>
+          <w:tcPr>
+            <w:tcW w:type="dxa" w:w="4320"/>
+          </w:tcPr>
+          <w:p>
+            <w:r>
+              <w:rPr>
+                <w:sz w:val="20"/>
+              </w:rPr>
+              <w:t>**USD 50.260** (0a **33.010** / 0b **8.625** / 0c **8.625**)</w:t>
+            </w:r>
+          </w:p>
+        </w:tc>
+      </w:tr>
+      <w:tr>
+        <w:tc>
+          <w:tcPr>
+            <w:tcW w:type="dxa" w:w="4320"/>
+          </w:tcPr>
+          <w:p>
+            <w:r>
+              <w:rPr>
+                <w:sz w:val="20"/>
+              </w:rPr>
+              <w:t>Caja al Day-D (inicio M1)</w:t>
+            </w:r>
+          </w:p>
+        </w:tc>
+        <w:tc>
+          <w:tcPr>
+            <w:tcW w:type="dxa" w:w="4320"/>
+          </w:tcPr>
+          <w:p>
+            <w:r>
+              <w:rPr>
+                <w:sz w:val="20"/>
+              </w:rPr>
+              <w:t>**USD 187.152**</w:t>
+            </w:r>
+          </w:p>
+        </w:tc>
+      </w:tr>
+      <w:tr>
+        <w:tc>
+          <w:tcPr>
+            <w:tcW w:type="dxa" w:w="4320"/>
+          </w:tcPr>
+          <w:p>
+            <w:r>
+              <w:rPr>
+                <w:sz w:val="20"/>
+              </w:rPr>
+              <w:t>Burn M1–M12</w:t>
+            </w:r>
+          </w:p>
+        </w:tc>
+        <w:tc>
+          <w:tcPr>
+            <w:tcW w:type="dxa" w:w="4320"/>
+          </w:tcPr>
+          <w:p>
+            <w:r>
+              <w:rPr>
+                <w:sz w:val="20"/>
+              </w:rPr>
+              <w:t>**USD 172.152** (Detallado ≈**14.346**/mes; desglose nómina+HQ+mkt en MODELO S1.2b / PRESUPUESTO — no sumar sub-líneas inventadas)</w:t>
+            </w:r>
+          </w:p>
+        </w:tc>
+      </w:tr>
+      <w:tr>
+        <w:tc>
+          <w:tcPr>
+            <w:tcW w:type="dxa" w:w="4320"/>
+          </w:tcPr>
+          <w:p>
+            <w:r>
+              <w:rPr>
+                <w:sz w:val="20"/>
+              </w:rPr>
+              <w:t>Reserva caja</w:t>
+            </w:r>
+          </w:p>
+        </w:tc>
+        <w:tc>
+          <w:tcPr>
+            <w:tcW w:type="dxa" w:w="4320"/>
+          </w:tcPr>
+          <w:p>
+            <w:r>
+              <w:rPr>
+                <w:sz w:val="20"/>
+              </w:rPr>
+              <w:t>**15.000**</w:t>
+            </w:r>
+          </w:p>
+        </w:tc>
+      </w:tr>
+      <w:tr>
+        <w:tc>
+          <w:tcPr>
+            <w:tcW w:type="dxa" w:w="4320"/>
+          </w:tcPr>
+          <w:p>
+            <w:r>
+              <w:rPr>
+                <w:sz w:val="20"/>
+              </w:rPr>
+              <w:t>Burn prom. mensual (post-Day-D)</w:t>
+            </w:r>
+          </w:p>
+        </w:tc>
+        <w:tc>
+          <w:tcPr>
+            <w:tcW w:type="dxa" w:w="4320"/>
+          </w:tcPr>
+          <w:p>
+            <w:r>
+              <w:rPr>
+                <w:sz w:val="20"/>
+              </w:rPr>
+              <w:t>**~USD 14.346**</w:t>
+            </w:r>
+          </w:p>
+        </w:tc>
+      </w:tr>
+      <w:tr>
+        <w:tc>
+          <w:tcPr>
+            <w:tcW w:type="dxa" w:w="4320"/>
+          </w:tcPr>
+          <w:p>
+            <w:r>
+              <w:rPr>
+                <w:sz w:val="20"/>
+              </w:rPr>
+              <w:t>Identidad categorías = timing</w:t>
+            </w:r>
+          </w:p>
+        </w:tc>
+        <w:tc>
+          <w:tcPr>
+            <w:tcW w:type="dxa" w:w="4320"/>
+          </w:tcPr>
+          <w:p>
+            <w:r>
+              <w:rPr>
+                <w:sz w:val="20"/>
+              </w:rPr>
+              <w:t>**0** (validación Detallado)</w:t>
+            </w:r>
+          </w:p>
+        </w:tc>
+      </w:tr>
+      <w:tr>
+        <w:tc>
+          <w:tcPr>
+            <w:tcW w:type="dxa" w:w="4320"/>
+          </w:tcPr>
+          <w:p>
+            <w:r>
+              <w:rPr>
+                <w:sz w:val="20"/>
+              </w:rPr>
+              <w:t>Identidad SAFE</w:t>
+            </w:r>
+          </w:p>
+        </w:tc>
+        <w:tc>
+          <w:tcPr>
+            <w:tcW w:type="dxa" w:w="4320"/>
+          </w:tcPr>
+          <w:p>
+            <w:r>
+              <w:rPr>
+                <w:sz w:val="20"/>
+              </w:rPr>
+              <w:t>**50.260 + 172.152 + 15.000 = 237.412**</w:t>
             </w:r>
           </w:p>
         </w:tc>
       </w:tr>
     </w:tbl>
     <w:p/>
+    <w:p>
+      <w:r>
+        <w:rPr>
+          <w:i/>
+        </w:rPr>
+        <w:t>**Esc.1 vigente:** pricing **45/60/70 + %GMV 8/7/5**; ingresos Y1 **228.796**; costos Y1 **169.717**; FCF Y1 **+59.079**; cash M12 **246.231**. Tabla M1–M12: [PROYECCION_FINANCIERA_12M.md](PROYECCION_FINANCIERA_12M.md) §1.1 · [MODELO_FINANCIERO_ZONIX_PHARMA.md](MODELO_FINANCIERO_ZONIX_PHARMA.md) §S3.1.</w:t>
+      </w:r>
+    </w:p>
     <w:p>
       <w:r/>
       <w:r>
@@ -1695,7 +2260,7 @@
               <w:rPr>
                 <w:sz w:val="20"/>
               </w:rPr>
-              <w:t>Runway</w:t>
+              <w:t>Capital pedido</w:t>
             </w:r>
           </w:p>
         </w:tc>
@@ -1708,7 +2273,7 @@
               <w:rPr>
                 <w:sz w:val="20"/>
               </w:rPr>
-              <w:t>Fase 0 (~90 días) + **12 meses** post-Day-D</w:t>
+              <w:t>**USD 237.412** _(≈237k)_</w:t>
             </w:r>
           </w:p>
         </w:tc>
@@ -1723,7 +2288,7 @@
               <w:rPr>
                 <w:sz w:val="20"/>
               </w:rPr>
-              <w:t>Buffer inflación VE</w:t>
+              <w:t>Runway</w:t>
             </w:r>
           </w:p>
         </w:tc>
@@ -1736,7 +2301,7 @@
               <w:rPr>
                 <w:sz w:val="20"/>
               </w:rPr>
-              <w:t>**20%** incluido</w:t>
+              <w:t>**Fase 0 (~90 días)** + **12 meses** post-Day-D</w:t>
             </w:r>
           </w:p>
         </w:tc>
@@ -1751,7 +2316,7 @@
               <w:rPr>
                 <w:sz w:val="20"/>
               </w:rPr>
-              <w:t>Revenue acumulado año 1</w:t>
+              <w:t>Burn promedio mensual</w:t>
             </w:r>
           </w:p>
         </w:tc>
@@ -1764,7 +2329,7 @@
               <w:rPr>
                 <w:sz w:val="20"/>
               </w:rPr>
-              <w:t>**~USD 60k**</w:t>
+              <w:t>**~USD 14.346**</w:t>
             </w:r>
           </w:p>
         </w:tc>
@@ -1779,7 +2344,7 @@
               <w:rPr>
                 <w:sz w:val="20"/>
               </w:rPr>
-              <w:t>Ingreso medio por farmacia</w:t>
+              <w:t>One-shots</w:t>
             </w:r>
           </w:p>
         </w:tc>
@@ -1792,7 +2357,7 @@
               <w:rPr>
                 <w:sz w:val="20"/>
               </w:rPr>
-              <w:t>**~USD 50/mes** *(placeholder)*</w:t>
+              <w:t>**USD 22.365**</w:t>
             </w:r>
           </w:p>
         </w:tc>
@@ -1807,7 +2372,7 @@
               <w:rPr>
                 <w:sz w:val="20"/>
               </w:rPr>
-              <w:t>CAC</w:t>
+              <w:t>Fase 0 + caja Day-D</w:t>
             </w:r>
           </w:p>
         </w:tc>
@@ -1820,7 +2385,7 @@
               <w:rPr>
                 <w:sz w:val="20"/>
               </w:rPr>
-              <w:t>**USD 139**</w:t>
+              <w:t>**USD 50.260** outflow; **USD 187.152** caja al Day-D</w:t>
             </w:r>
           </w:p>
         </w:tc>
@@ -1835,7 +2400,7 @@
               <w:rPr>
                 <w:sz w:val="20"/>
               </w:rPr>
-              <w:t>Churn mensual</w:t>
+              <w:t>Buffer ya incluido (inflación VE)</w:t>
             </w:r>
           </w:p>
         </w:tc>
@@ -1848,7 +2413,7 @@
               <w:rPr>
                 <w:sz w:val="20"/>
               </w:rPr>
-              <w:t>5%</w:t>
+              <w:t>20% (en contingencia del burn)</w:t>
             </w:r>
           </w:p>
         </w:tc>
@@ -1863,7 +2428,7 @@
               <w:rPr>
                 <w:sz w:val="20"/>
               </w:rPr>
-              <w:t>LTV</w:t>
+              <w:t>ARPF / CAC / LTV</w:t>
             </w:r>
           </w:p>
         </w:tc>
@@ -1876,7 +2441,7 @@
               <w:rPr>
                 <w:sz w:val="20"/>
               </w:rPr>
-              <w:t>**USD 1.000**</w:t>
+              <w:t>USD **~52** / **139** / **1.040** _(ARPF Excel v4; LTV=52×20 — UNIT)_</w:t>
             </w:r>
           </w:p>
         </w:tc>
@@ -1904,7 +2469,7 @@
               <w:rPr>
                 <w:sz w:val="20"/>
               </w:rPr>
-              <w:t>**~7,2x**</w:t>
+              <w:t>**~7,5x**</w:t>
             </w:r>
           </w:p>
         </w:tc>
@@ -1919,7 +2484,7 @@
               <w:rPr>
                 <w:sz w:val="20"/>
               </w:rPr>
-              <w:t>Payback CAC</w:t>
+              <w:t>Cash / equilibrio M12</w:t>
             </w:r>
           </w:p>
         </w:tc>
@@ -1932,63 +2497,7 @@
               <w:rPr>
                 <w:sz w:val="20"/>
               </w:rPr>
-              <w:t>**~2,8 meses**</w:t>
-            </w:r>
-          </w:p>
-        </w:tc>
-      </w:tr>
-      <w:tr>
-        <w:tc>
-          <w:tcPr>
-            <w:tcW w:type="dxa" w:w="4320"/>
-          </w:tcPr>
-          <w:p>
-            <w:r>
-              <w:rPr>
-                <w:sz w:val="20"/>
-              </w:rPr>
-              <w:t>**Equilibrio mensual**</w:t>
-            </w:r>
-          </w:p>
-        </w:tc>
-        <w:tc>
-          <w:tcPr>
-            <w:tcW w:type="dxa" w:w="4320"/>
-          </w:tcPr>
-          <w:p>
-            <w:r>
-              <w:rPr>
-                <w:sz w:val="20"/>
-              </w:rPr>
-              <w:t>**Casi M12** (~159 activas)</w:t>
-            </w:r>
-          </w:p>
-        </w:tc>
-      </w:tr>
-      <w:tr>
-        <w:tc>
-          <w:tcPr>
-            <w:tcW w:type="dxa" w:w="4320"/>
-          </w:tcPr>
-          <w:p>
-            <w:r>
-              <w:rPr>
-                <w:sz w:val="20"/>
-              </w:rPr>
-              <w:t>**Cash cierre M12**</w:t>
-            </w:r>
-          </w:p>
-        </w:tc>
-        <w:tc>
-          <w:tcPr>
-            <w:tcW w:type="dxa" w:w="4320"/>
-          </w:tcPr>
-          <w:p>
-            <w:r>
-              <w:rPr>
-                <w:sz w:val="20"/>
-              </w:rPr>
-              <w:t>**~USD 40.831**</w:t>
+              <w:t>**Cash M12 246.231** (esc.1: 187.152 + FCF +59.079); BE FCF desde **M5** (FCF M1–M4 negativo)</w:t>
             </w:r>
           </w:p>
         </w:tc>
@@ -2000,7 +2509,7 @@
         <w:pStyle w:val="Heading2"/>
       </w:pPr>
       <w:r>
-        <w:t>Sensibilidad</w:t>
+        <w:t>Sensibilidad del modelo</w:t>
       </w:r>
     </w:p>
     <w:tbl>
@@ -2010,15 +2519,19 @@
         <w:tblLook w:firstColumn="1" w:firstRow="1" w:lastColumn="0" w:lastRow="0" w:noHBand="0" w:noVBand="1" w:val="04A0"/>
       </w:tblPr>
       <w:tblGrid>
-        <w:gridCol w:w="2160"/>
-        <w:gridCol w:w="2160"/>
-        <w:gridCol w:w="2160"/>
-        <w:gridCol w:w="2160"/>
+        <w:gridCol w:w="1080"/>
+        <w:gridCol w:w="1080"/>
+        <w:gridCol w:w="1080"/>
+        <w:gridCol w:w="1080"/>
+        <w:gridCol w:w="1080"/>
+        <w:gridCol w:w="1080"/>
+        <w:gridCol w:w="1080"/>
+        <w:gridCol w:w="1080"/>
       </w:tblGrid>
       <w:tr>
         <w:tc>
           <w:tcPr>
-            <w:tcW w:type="dxa" w:w="2160"/>
+            <w:tcW w:type="dxa" w:w="1080"/>
             <w:shd w:fill="1E2A5A"/>
           </w:tcPr>
           <w:p>
@@ -2034,7 +2547,7 @@
         </w:tc>
         <w:tc>
           <w:tcPr>
-            <w:tcW w:type="dxa" w:w="2160"/>
+            <w:tcW w:type="dxa" w:w="1080"/>
             <w:shd w:fill="1E2A5A"/>
           </w:tcPr>
           <w:p>
@@ -2044,13 +2557,13 @@
                 <w:color w:val="FFFFFF"/>
                 <w:sz w:val="20"/>
               </w:rPr>
-              <w:t>Activas M12</w:t>
+              <w:t>Tasa firma/mes</w:t>
             </w:r>
           </w:p>
         </w:tc>
         <w:tc>
           <w:tcPr>
-            <w:tcW w:type="dxa" w:w="2160"/>
+            <w:tcW w:type="dxa" w:w="1080"/>
             <w:shd w:fill="1E2A5A"/>
           </w:tcPr>
           <w:p>
@@ -2060,13 +2573,77 @@
                 <w:color w:val="FFFFFF"/>
                 <w:sz w:val="20"/>
               </w:rPr>
-              <w:t>Revenue M12</w:t>
+              <w:t>Churn</w:t>
             </w:r>
           </w:p>
         </w:tc>
         <w:tc>
           <w:tcPr>
-            <w:tcW w:type="dxa" w:w="2160"/>
+            <w:tcW w:type="dxa" w:w="1080"/>
+            <w:shd w:fill="1E2A5A"/>
+          </w:tcPr>
+          <w:p>
+            <w:r>
+              <w:rPr>
+                <w:b/>
+                <w:color w:val="FFFFFF"/>
+                <w:sz w:val="20"/>
+              </w:rPr>
+              <w:t>ARPF\*</w:t>
+            </w:r>
+          </w:p>
+        </w:tc>
+        <w:tc>
+          <w:tcPr>
+            <w:tcW w:type="dxa" w:w="1080"/>
+            <w:shd w:fill="1E2A5A"/>
+          </w:tcPr>
+          <w:p>
+            <w:r>
+              <w:rPr>
+                <w:b/>
+                <w:color w:val="FFFFFF"/>
+                <w:sz w:val="20"/>
+              </w:rPr>
+              <w:t>Activas M12 (ref.)</w:t>
+            </w:r>
+          </w:p>
+        </w:tc>
+        <w:tc>
+          <w:tcPr>
+            <w:tcW w:type="dxa" w:w="1080"/>
+            <w:shd w:fill="1E2A5A"/>
+          </w:tcPr>
+          <w:p>
+            <w:r>
+              <w:rPr>
+                <w:b/>
+                <w:color w:val="FFFFFF"/>
+                <w:sz w:val="20"/>
+              </w:rPr>
+              <w:t>Revenue M12 (ref.)</w:t>
+            </w:r>
+          </w:p>
+        </w:tc>
+        <w:tc>
+          <w:tcPr>
+            <w:tcW w:type="dxa" w:w="1080"/>
+            <w:shd w:fill="1E2A5A"/>
+          </w:tcPr>
+          <w:p>
+            <w:r>
+              <w:rPr>
+                <w:b/>
+                <w:color w:val="FFFFFF"/>
+                <w:sz w:val="20"/>
+              </w:rPr>
+              <w:t>Equilibrio mensual (ref.)</w:t>
+            </w:r>
+          </w:p>
+        </w:tc>
+        <w:tc>
+          <w:tcPr>
+            <w:tcW w:type="dxa" w:w="1080"/>
             <w:shd w:fill="1E2A5A"/>
           </w:tcPr>
           <w:p>
@@ -2084,20 +2661,59 @@
       <w:tr>
         <w:tc>
           <w:tcPr>
-            <w:tcW w:type="dxa" w:w="2160"/>
+            <w:tcW w:type="dxa" w:w="1080"/>
           </w:tcPr>
           <w:p>
             <w:r>
               <w:rPr>
                 <w:sz w:val="20"/>
               </w:rPr>
-              <w:t>Pesimista (20%)</w:t>
+              <w:t>Pesimista (probabilidad 20%)</w:t>
             </w:r>
           </w:p>
         </w:tc>
         <w:tc>
           <w:tcPr>
-            <w:tcW w:type="dxa" w:w="2160"/>
+            <w:tcW w:type="dxa" w:w="1080"/>
+          </w:tcPr>
+          <w:p>
+            <w:r>
+              <w:rPr>
+                <w:sz w:val="20"/>
+              </w:rPr>
+              <w:t>**~50% plan** _(~8 firmas/mes ref.)_</w:t>
+            </w:r>
+          </w:p>
+        </w:tc>
+        <w:tc>
+          <w:tcPr>
+            <w:tcW w:type="dxa" w:w="1080"/>
+          </w:tcPr>
+          <w:p>
+            <w:r>
+              <w:rPr>
+                <w:sz w:val="20"/>
+              </w:rPr>
+              <w:t>7%</w:t>
+            </w:r>
+          </w:p>
+        </w:tc>
+        <w:tc>
+          <w:tcPr>
+            <w:tcW w:type="dxa" w:w="1080"/>
+          </w:tcPr>
+          <w:p>
+            <w:r>
+              <w:rPr>
+                <w:sz w:val="20"/>
+              </w:rPr>
+              <w:t>USD 40</w:t>
+            </w:r>
+          </w:p>
+        </w:tc>
+        <w:tc>
+          <w:tcPr>
+            <w:tcW w:type="dxa" w:w="1080"/>
           </w:tcPr>
           <w:p>
             <w:r>
@@ -2110,27 +2726,40 @@
         </w:tc>
         <w:tc>
           <w:tcPr>
-            <w:tcW w:type="dxa" w:w="2160"/>
+            <w:tcW w:type="dxa" w:w="1080"/>
           </w:tcPr>
           <w:p>
             <w:r>
               <w:rPr>
                 <w:sz w:val="20"/>
               </w:rPr>
-              <w:t>**~USD 4.800**</w:t>
+              <w:t>**`[PENDIENTE FP&amp;A — esc.1]`**</w:t>
             </w:r>
           </w:p>
         </w:tc>
         <w:tc>
           <w:tcPr>
-            <w:tcW w:type="dxa" w:w="2160"/>
+            <w:tcW w:type="dxa" w:w="1080"/>
           </w:tcPr>
           <w:p>
             <w:r>
               <w:rPr>
                 <w:sz w:val="20"/>
               </w:rPr>
-              <w:t>**~USD 25–32k**</w:t>
+              <w:t>Esc.1 base BE FCF M5; P10 sin modelo cerrado</w:t>
+            </w:r>
+          </w:p>
+        </w:tc>
+        <w:tc>
+          <w:tcPr>
+            <w:tcW w:type="dxa" w:w="1080"/>
+          </w:tcPr>
+          <w:p>
+            <w:r>
+              <w:rPr>
+                <w:sz w:val="20"/>
+              </w:rPr>
+              <w:t>**`[PENDIENTE FP&amp;A — esc.1]`**</w:t>
             </w:r>
           </w:p>
         </w:tc>
@@ -2138,20 +2767,59 @@
       <w:tr>
         <w:tc>
           <w:tcPr>
-            <w:tcW w:type="dxa" w:w="2160"/>
+            <w:tcW w:type="dxa" w:w="1080"/>
           </w:tcPr>
           <w:p>
             <w:r>
               <w:rPr>
                 <w:sz w:val="20"/>
               </w:rPr>
-              <w:t>**Base (50%)**</w:t>
+              <w:t>**Base (probabilidad 50%)**</w:t>
             </w:r>
           </w:p>
         </w:tc>
         <w:tc>
           <w:tcPr>
-            <w:tcW w:type="dxa" w:w="2160"/>
+            <w:tcW w:type="dxa" w:w="1080"/>
+          </w:tcPr>
+          <w:p>
+            <w:r>
+              <w:rPr>
+                <w:sz w:val="20"/>
+              </w:rPr>
+              <w:t>**~15**/mes post-Day-D</w:t>
+            </w:r>
+          </w:p>
+        </w:tc>
+        <w:tc>
+          <w:tcPr>
+            <w:tcW w:type="dxa" w:w="1080"/>
+          </w:tcPr>
+          <w:p>
+            <w:r>
+              <w:rPr>
+                <w:sz w:val="20"/>
+              </w:rPr>
+              <w:t>**5%**</w:t>
+            </w:r>
+          </w:p>
+        </w:tc>
+        <w:tc>
+          <w:tcPr>
+            <w:tcW w:type="dxa" w:w="1080"/>
+          </w:tcPr>
+          <w:p>
+            <w:r>
+              <w:rPr>
+                <w:sz w:val="20"/>
+              </w:rPr>
+              <w:t>**USD ~52**</w:t>
+            </w:r>
+          </w:p>
+        </w:tc>
+        <w:tc>
+          <w:tcPr>
+            <w:tcW w:type="dxa" w:w="1080"/>
           </w:tcPr>
           <w:p>
             <w:r>
@@ -2164,27 +2832,40 @@
         </w:tc>
         <w:tc>
           <w:tcPr>
-            <w:tcW w:type="dxa" w:w="2160"/>
+            <w:tcW w:type="dxa" w:w="1080"/>
           </w:tcPr>
           <w:p>
             <w:r>
               <w:rPr>
                 <w:sz w:val="20"/>
               </w:rPr>
-              <w:t>**~USD 7.950**</w:t>
+              <w:t>**~USD 29.892** (M12 esc.1)</w:t>
             </w:r>
           </w:p>
         </w:tc>
         <w:tc>
           <w:tcPr>
-            <w:tcW w:type="dxa" w:w="2160"/>
+            <w:tcW w:type="dxa" w:w="1080"/>
           </w:tcPr>
           <w:p>
             <w:r>
               <w:rPr>
                 <w:sz w:val="20"/>
               </w:rPr>
-              <w:t>**~USD 40.831**</w:t>
+              <w:t>**M5** (FCF+ desde M5)</w:t>
+            </w:r>
+          </w:p>
+        </w:tc>
+        <w:tc>
+          <w:tcPr>
+            <w:tcW w:type="dxa" w:w="1080"/>
+          </w:tcPr>
+          <w:p>
+            <w:r>
+              <w:rPr>
+                <w:sz w:val="20"/>
+              </w:rPr>
+              <w:t>**USD 246.231** (187.152 + FCF +59.079)</w:t>
             </w:r>
           </w:p>
         </w:tc>
@@ -2192,20 +2873,59 @@
       <w:tr>
         <w:tc>
           <w:tcPr>
-            <w:tcW w:type="dxa" w:w="2160"/>
+            <w:tcW w:type="dxa" w:w="1080"/>
           </w:tcPr>
           <w:p>
             <w:r>
               <w:rPr>
                 <w:sz w:val="20"/>
               </w:rPr>
-              <w:t>Optimista (30%)</w:t>
+              <w:t>Optimista (probabilidad 30%)</w:t>
             </w:r>
           </w:p>
         </w:tc>
         <w:tc>
           <w:tcPr>
-            <w:tcW w:type="dxa" w:w="2160"/>
+            <w:tcW w:type="dxa" w:w="1080"/>
+          </w:tcPr>
+          <w:p>
+            <w:r>
+              <w:rPr>
+                <w:sz w:val="20"/>
+              </w:rPr>
+              <w:t>**130% plan** _(ref. §7.3)_</w:t>
+            </w:r>
+          </w:p>
+        </w:tc>
+        <w:tc>
+          <w:tcPr>
+            <w:tcW w:type="dxa" w:w="1080"/>
+          </w:tcPr>
+          <w:p>
+            <w:r>
+              <w:rPr>
+                <w:sz w:val="20"/>
+              </w:rPr>
+              <w:t>4%</w:t>
+            </w:r>
+          </w:p>
+        </w:tc>
+        <w:tc>
+          <w:tcPr>
+            <w:tcW w:type="dxa" w:w="1080"/>
+          </w:tcPr>
+          <w:p>
+            <w:r>
+              <w:rPr>
+                <w:sz w:val="20"/>
+              </w:rPr>
+              <w:t>USD 55</w:t>
+            </w:r>
+          </w:p>
+        </w:tc>
+        <w:tc>
+          <w:tcPr>
+            <w:tcW w:type="dxa" w:w="1080"/>
           </w:tcPr>
           <w:p>
             <w:r>
@@ -2218,27 +2938,40 @@
         </w:tc>
         <w:tc>
           <w:tcPr>
-            <w:tcW w:type="dxa" w:w="2160"/>
+            <w:tcW w:type="dxa" w:w="1080"/>
           </w:tcPr>
           <w:p>
             <w:r>
               <w:rPr>
                 <w:sz w:val="20"/>
               </w:rPr>
-              <w:t>**~USD 11.000**</w:t>
+              <w:t>**`[PENDIENTE FP&amp;A — esc.1]`**</w:t>
             </w:r>
           </w:p>
         </w:tc>
         <w:tc>
           <w:tcPr>
-            <w:tcW w:type="dxa" w:w="2160"/>
+            <w:tcW w:type="dxa" w:w="1080"/>
           </w:tcPr>
           <w:p>
             <w:r>
               <w:rPr>
                 <w:sz w:val="20"/>
               </w:rPr>
-              <w:t>**~USD 48–55k**</w:t>
+              <w:t>Escala Sales</w:t>
+            </w:r>
+          </w:p>
+        </w:tc>
+        <w:tc>
+          <w:tcPr>
+            <w:tcW w:type="dxa" w:w="1080"/>
+          </w:tcPr>
+          <w:p>
+            <w:r>
+              <w:rPr>
+                <w:sz w:val="20"/>
+              </w:rPr>
+              <w:t>**`[PENDIENTE FP&amp;A — esc.1]`**</w:t>
             </w:r>
           </w:p>
         </w:tc>
@@ -2246,38 +2979,22 @@
     </w:tbl>
     <w:p/>
     <w:p>
-      <w:r/>
+      <w:r>
+        <w:t xml:space="preserve">\*Misma convención que la tabla anterior: ARPF es </w:t>
+      </w:r>
       <w:r>
         <w:rPr>
           <w:b/>
         </w:rPr>
-        <w:t>Nota de riesgo:</w:t>
-      </w:r>
-      <w:r>
-        <w:t xml:space="preserve"> si el ingreso real por farmacia cae a </w:t>
-      </w:r>
-      <w:r>
-        <w:rPr>
-          <w:b/>
-        </w:rPr>
-        <w:t>~USD 41/mes</w:t>
-      </w:r>
-      <w:r>
-        <w:t xml:space="preserve">, el ratio LTV/CAC sigue en </w:t>
-      </w:r>
-      <w:r>
-        <w:rPr>
-          <w:b/>
-        </w:rPr>
-        <w:t>~5,9x</w:t>
-      </w:r>
-      <w:r>
-        <w:t xml:space="preserve"> — saludable, pero el equilibrio mensual se retrasa.</w:t>
+        <w:t>referencia provisional</w:t>
+      </w:r>
+      <w:r>
+        <w:t xml:space="preserve"> hasta recalibrar con GMV real y modelo híbrido ([PROPUESTA_VALOR_CLIENTE_B2B.md](PROPUESTA_VALOR_CLIENTE_B2B.md) §5).</w:t>
       </w:r>
     </w:p>
     <w:p>
       <w:r>
-        <w:t>────────────────────────────────────────</w:t>
+        <w:t>Detalle de las 3 sensibilidades en [PROYECCION_FINANCIERA_12M.md](PROYECCION_FINANCIERA_12M.md) sección 7.</w:t>
       </w:r>
     </w:p>
     <w:p>
@@ -2285,7 +3002,7 @@
         <w:pStyle w:val="Heading1"/>
       </w:pPr>
       <w:r>
-        <w:t>Instrumento de inversión (referencia — no aplica a Gabriel por defecto)</w:t>
+        <w:t>Instrumento de inversión propuesto</w:t>
       </w:r>
     </w:p>
     <w:p>
@@ -2299,44 +3016,85 @@
         <w:t>SAFE post-money</w:t>
       </w:r>
       <w:r>
-        <w:t xml:space="preserve"> con cap según tier: </w:t>
+        <w:t xml:space="preserve"> con cap ref. </w:t>
       </w:r>
       <w:r>
         <w:rPr>
           <w:b/>
         </w:rPr>
-        <w:t>600k (Lean ~112k)</w:t>
-      </w:r>
-      <w:r>
-        <w:t xml:space="preserve"> · </w:t>
+        <w:t>600k (Lean 237.412)</w:t>
+      </w:r>
+      <w:r>
+        <w:t xml:space="preserve"> — equity </w:t>
       </w:r>
       <w:r>
         <w:rPr>
           <w:b/>
         </w:rPr>
-        <w:t>~913k (Base ~157k)</w:t>
-      </w:r>
-      <w:r>
-        <w:t xml:space="preserve"> · </w:t>
+        <w:t>~39,57%</w:t>
+      </w:r>
+      <w:r>
+        <w:t>.</w:t>
+      </w:r>
+    </w:p>
+    <w:p>
+      <w:r>
+        <w:t xml:space="preserve">- </w:t>
       </w:r>
       <w:r>
         <w:rPr>
           <w:b/>
         </w:rPr>
-        <w:t>~1,2M (Growth ~187k)</w:t>
-      </w:r>
-      <w:r>
-        <w:t>.</w:t>
+        <w:t>Ticket sugerido:</w:t>
+      </w:r>
+      <w:r>
+        <w:t xml:space="preserve"> USD 25.000 / 50.000 / </w:t>
+      </w:r>
+      <w:r>
+        <w:rPr>
+          <w:b/>
+        </w:rPr>
+        <w:t>237.412</w:t>
+      </w:r>
+      <w:r>
+        <w:t xml:space="preserve"> (lead Lean v4 Excel — ask único).</w:t>
       </w:r>
     </w:p>
     <w:p>
       <w:r>
-        <w:t>- Ticket sugerido a inversores: USD 25k / 50k / lead mínimo ~112k.</w:t>
+        <w:t xml:space="preserve">- </w:t>
+      </w:r>
+      <w:r>
+        <w:rPr>
+          <w:b/>
+        </w:rPr>
+        <w:t>Equity implícito Lean:</w:t>
+      </w:r>
+      <w:r>
+        <w:t xml:space="preserve"> </w:t>
+      </w:r>
+      <w:r>
+        <w:rPr>
+          <w:b/>
+        </w:rPr>
+        <w:t>~39,57%</w:t>
+      </w:r>
+      <w:r>
+        <w:t xml:space="preserve"> (237.412 / 600k).</w:t>
       </w:r>
     </w:p>
     <w:p>
       <w:r>
-        <w:t>────────────────────────────────────────</w:t>
+        <w:t xml:space="preserve">- </w:t>
+      </w:r>
+      <w:r>
+        <w:rPr>
+          <w:b/>
+        </w:rPr>
+        <w:t>Cap table:</w:t>
+      </w:r>
+      <w:r>
+        <w:t xml:space="preserve"> [ESTRUCTURA_LEGAL_Y_EQUITY.md](ESTRUCTURA_LEGAL_Y_EQUITY.md).</w:t>
       </w:r>
     </w:p>
     <w:p>
@@ -2344,254 +3102,190 @@
         <w:pStyle w:val="Heading1"/>
       </w:pPr>
       <w:r>
-        <w:t>Equipo piloto Lean</w:t>
+        <w:t>Equipo</w:t>
       </w:r>
     </w:p>
-    <w:tbl>
-      <w:tblPr>
-        <w:tblStyle w:val="TableGrid"/>
-        <w:tblW w:type="auto" w:w="0"/>
-        <w:tblLook w:firstColumn="1" w:firstRow="1" w:lastColumn="0" w:lastRow="0" w:noHBand="0" w:noVBand="1" w:val="04A0"/>
-      </w:tblPr>
-      <w:tblGrid>
-        <w:gridCol w:w="4320"/>
-        <w:gridCol w:w="4320"/>
-      </w:tblGrid>
-      <w:tr>
-        <w:tc>
-          <w:tcPr>
-            <w:tcW w:type="dxa" w:w="4320"/>
-            <w:shd w:fill="1E2A5A"/>
-          </w:tcPr>
-          <w:p>
-            <w:r>
-              <w:rPr>
-                <w:b/>
-                <w:color w:val="FFFFFF"/>
-                <w:sz w:val="20"/>
-              </w:rPr>
-              <w:t>Rol</w:t>
-            </w:r>
-          </w:p>
-        </w:tc>
-        <w:tc>
-          <w:tcPr>
-            <w:tcW w:type="dxa" w:w="4320"/>
-            <w:shd w:fill="1E2A5A"/>
-          </w:tcPr>
-          <w:p>
-            <w:r>
-              <w:rPr>
-                <w:b/>
-                <w:color w:val="FFFFFF"/>
-                <w:sz w:val="20"/>
-              </w:rPr>
-              <w:t>Compensación ref. (USD/mes)</w:t>
-            </w:r>
-          </w:p>
-        </w:tc>
-      </w:tr>
-      <w:tr>
-        <w:tc>
-          <w:tcPr>
-            <w:tcW w:type="dxa" w:w="4320"/>
-          </w:tcPr>
-          <w:p>
-            <w:r>
-              <w:rPr>
-                <w:sz w:val="20"/>
-              </w:rPr>
-              <w:t>Founder / CEO / CTO (Abrahan Pulido)</w:t>
-            </w:r>
-          </w:p>
-        </w:tc>
-        <w:tc>
-          <w:tcPr>
-            <w:tcW w:type="dxa" w:w="4320"/>
-          </w:tcPr>
-          <w:p>
-            <w:r>
-              <w:rPr>
-                <w:sz w:val="20"/>
-              </w:rPr>
-              <w:t>**1.000**</w:t>
-            </w:r>
-          </w:p>
-        </w:tc>
-      </w:tr>
-      <w:tr>
-        <w:tc>
-          <w:tcPr>
-            <w:tcW w:type="dxa" w:w="4320"/>
-          </w:tcPr>
-          <w:p>
-            <w:r>
-              <w:rPr>
-                <w:sz w:val="20"/>
-              </w:rPr>
-              <w:t>Co-CEO / CEO operativo</w:t>
-            </w:r>
-          </w:p>
-        </w:tc>
-        <w:tc>
-          <w:tcPr>
-            <w:tcW w:type="dxa" w:w="4320"/>
-          </w:tcPr>
-          <w:p>
-            <w:r>
-              <w:rPr>
-                <w:sz w:val="20"/>
-              </w:rPr>
-              <w:t>**1.000**</w:t>
-            </w:r>
-          </w:p>
-        </w:tc>
-      </w:tr>
-      <w:tr>
-        <w:tc>
-          <w:tcPr>
-            <w:tcW w:type="dxa" w:w="4320"/>
-          </w:tcPr>
-          <w:p>
-            <w:r>
-              <w:rPr>
-                <w:sz w:val="20"/>
-              </w:rPr>
-              <w:t>Dev junior</w:t>
-            </w:r>
-          </w:p>
-        </w:tc>
-        <w:tc>
-          <w:tcPr>
-            <w:tcW w:type="dxa" w:w="4320"/>
-          </w:tcPr>
-          <w:p>
-            <w:r>
-              <w:rPr>
-                <w:sz w:val="20"/>
-              </w:rPr>
-              <w:t>**600**</w:t>
-            </w:r>
-          </w:p>
-        </w:tc>
-      </w:tr>
-      <w:tr>
-        <w:tc>
-          <w:tcPr>
-            <w:tcW w:type="dxa" w:w="4320"/>
-          </w:tcPr>
-          <w:p>
-            <w:r>
-              <w:rPr>
-                <w:sz w:val="20"/>
-              </w:rPr>
-              <w:t>Sales B2B (**×4**)</w:t>
-            </w:r>
-          </w:p>
-        </w:tc>
-        <w:tc>
-          <w:tcPr>
-            <w:tcW w:type="dxa" w:w="4320"/>
-          </w:tcPr>
-          <w:p>
-            <w:r>
-              <w:rPr>
-                <w:sz w:val="20"/>
-              </w:rPr>
-              <w:t>**350** base + **40**/firma</w:t>
-            </w:r>
-          </w:p>
-        </w:tc>
-      </w:tr>
-      <w:tr>
-        <w:tc>
-          <w:tcPr>
-            <w:tcW w:type="dxa" w:w="4320"/>
-          </w:tcPr>
-          <w:p>
-            <w:r>
-              <w:rPr>
-                <w:sz w:val="20"/>
-              </w:rPr>
-              <w:t>Customer Support + Community Manager</w:t>
-            </w:r>
-          </w:p>
-        </w:tc>
-        <w:tc>
-          <w:tcPr>
-            <w:tcW w:type="dxa" w:w="4320"/>
-          </w:tcPr>
-          <w:p>
-            <w:r>
-              <w:rPr>
-                <w:sz w:val="20"/>
-              </w:rPr>
-              <w:t>**400**</w:t>
-            </w:r>
-          </w:p>
-        </w:tc>
-      </w:tr>
-      <w:tr>
-        <w:tc>
-          <w:tcPr>
-            <w:tcW w:type="dxa" w:w="4320"/>
-          </w:tcPr>
-          <w:p>
-            <w:r>
-              <w:rPr>
-                <w:sz w:val="20"/>
-              </w:rPr>
-              <w:t>Contador externo</w:t>
-            </w:r>
-          </w:p>
-        </w:tc>
-        <w:tc>
-          <w:tcPr>
-            <w:tcW w:type="dxa" w:w="4320"/>
-          </w:tcPr>
-          <w:p>
-            <w:r>
-              <w:rPr>
-                <w:sz w:val="20"/>
-              </w:rPr>
-              <w:t>**130**</w:t>
-            </w:r>
-          </w:p>
-        </w:tc>
-      </w:tr>
-      <w:tr>
-        <w:tc>
-          <w:tcPr>
-            <w:tcW w:type="dxa" w:w="4320"/>
-          </w:tcPr>
-          <w:p>
-            <w:r>
-              <w:rPr>
-                <w:sz w:val="20"/>
-              </w:rPr>
-              <w:t>Abogado externo</w:t>
-            </w:r>
-          </w:p>
-        </w:tc>
-        <w:tc>
-          <w:tcPr>
-            <w:tcW w:type="dxa" w:w="4320"/>
-          </w:tcPr>
-          <w:p>
-            <w:r>
-              <w:rPr>
-                <w:sz w:val="20"/>
-              </w:rPr>
-              <w:t>**200**</w:t>
-            </w:r>
-          </w:p>
-        </w:tc>
-      </w:tr>
-    </w:tbl>
-    <w:p/>
     <w:p>
       <w:r>
-        <w:t>────────────────────────────────────────</w:t>
+        <w:t xml:space="preserve">- </w:t>
+      </w:r>
+      <w:r>
+        <w:rPr>
+          <w:b/>
+        </w:rPr>
+        <w:t>Founder / CEO / CTO:</w:t>
+      </w:r>
+      <w:r>
+        <w:t xml:space="preserve"> </w:t>
+      </w:r>
+      <w:r>
+        <w:rPr>
+          <w:b/>
+        </w:rPr>
+        <w:t>Abrahan Pulido</w:t>
+      </w:r>
+      <w:r>
+        <w:t xml:space="preserve"> — Ingeniero en Informática (IUTVAL), full stack Laravel + Flutter + MySQL, 8+ años en producto; fundador de </w:t>
+      </w:r>
+      <w:r>
+        <w:rPr>
+          <w:b/>
+        </w:rPr>
+        <w:t>Zonix Pharma</w:t>
+      </w:r>
+      <w:r>
+        <w:t xml:space="preserve"> (evolución del mismo stack desde delivery B2C), </w:t>
+      </w:r>
+      <w:r>
+        <w:rPr>
+          <w:b/>
+        </w:rPr>
+        <w:t>Corral X</w:t>
+      </w:r>
+      <w:r>
+        <w:t xml:space="preserve">, </w:t>
+      </w:r>
+      <w:r>
+        <w:rPr>
+          <w:b/>
+        </w:rPr>
+        <w:t>Zonix Imports</w:t>
+      </w:r>
+      <w:r>
+        <w:t xml:space="preserve"> y </w:t>
+      </w:r>
+      <w:r>
+        <w:rPr>
+          <w:b/>
+        </w:rPr>
+        <w:t>Aiblockweb</w:t>
+      </w:r>
+      <w:r>
+        <w:t>. Contacto: `ing.pulido.abrahan@gmail.com`, +58 412 4352014, [LinkedIn](https://www.linkedin.com/in/abrahan-pulido-909a35b7/), [aiblockweb.com](https://aiblockweb.com).</w:t>
+      </w:r>
+    </w:p>
+    <w:p>
+      <w:r>
+        <w:t xml:space="preserve">- </w:t>
+      </w:r>
+      <w:r>
+        <w:rPr>
+          <w:b/>
+        </w:rPr>
+        <w:t>Sales B2B (4 ejecutivos Lean):</w:t>
+      </w:r>
+      <w:r>
+        <w:t xml:space="preserve"> USD </w:t>
+      </w:r>
+      <w:r>
+        <w:rPr>
+          <w:b/>
+        </w:rPr>
+        <w:t>350</w:t>
+      </w:r>
+      <w:r>
+        <w:t xml:space="preserve"> base c/u + USD </w:t>
+      </w:r>
+      <w:r>
+        <w:rPr>
+          <w:b/>
+        </w:rPr>
+        <w:t>40</w:t>
+      </w:r>
+      <w:r>
+        <w:t xml:space="preserve"> comisión por farmacia firmada.</w:t>
+      </w:r>
+    </w:p>
+    <w:p>
+      <w:r>
+        <w:t xml:space="preserve">- </w:t>
+      </w:r>
+      <w:r>
+        <w:rPr>
+          <w:b/>
+        </w:rPr>
+        <w:t>Customer Support + Community Manager:</w:t>
+      </w:r>
+      <w:r>
+        <w:t xml:space="preserve"> USD </w:t>
+      </w:r>
+      <w:r>
+        <w:rPr>
+          <w:b/>
+        </w:rPr>
+        <w:t>500</w:t>
+      </w:r>
+      <w:r>
+        <w:t>/mes (tabla Lean / burn 237.412).</w:t>
+      </w:r>
+    </w:p>
+    <w:p>
+      <w:r>
+        <w:t xml:space="preserve">- </w:t>
+      </w:r>
+      <w:r>
+        <w:rPr>
+          <w:b/>
+        </w:rPr>
+        <w:t>Marketing Lead / Coordinador Partners:</w:t>
+      </w:r>
+      <w:r>
+        <w:t xml:space="preserve"> </w:t>
+      </w:r>
+      <w:r>
+        <w:rPr>
+          <w:b/>
+        </w:rPr>
+        <w:t>fuera del burn Lean 237.412</w:t>
+      </w:r>
+      <w:r>
+        <w:t xml:space="preserve"> (roadmap Base/Growth o post-wire) — no están en la tabla piloto Lean arriba.</w:t>
+      </w:r>
+    </w:p>
+    <w:p>
+      <w:r>
+        <w:t xml:space="preserve">- </w:t>
+      </w:r>
+      <w:r>
+        <w:rPr>
+          <w:b/>
+        </w:rPr>
+        <w:t>Contratación / nombres</w:t>
+      </w:r>
+      <w:r>
+        <w:t xml:space="preserve"> de los roles anteriores: plantilla operativa en [VOLCADO_RESPUESTAS_CUESTIONARIO.md](VOLCADO_RESPUESTAS_CUESTIONARIO.md) (montos ya cerrados en [PRESUPUESTO_12_MESES_REFERENCIA.md](PRESUPUESTO_12_MESES_REFERENCIA.md) §2).</w:t>
+      </w:r>
+    </w:p>
+    <w:p>
+      <w:r>
+        <w:t xml:space="preserve">- </w:t>
+      </w:r>
+      <w:r>
+        <w:rPr>
+          <w:b/>
+        </w:rPr>
+        <w:t>Contador + Abogado (+ asesor Rx) freelance:</w:t>
+      </w:r>
+      <w:r>
+        <w:t xml:space="preserve"> </w:t>
+      </w:r>
+      <w:r>
+        <w:rPr>
+          <w:b/>
+        </w:rPr>
+        <w:t>USD 330/mes</w:t>
+      </w:r>
+      <w:r>
+        <w:t xml:space="preserve"> agregados (incluye asesor regulatorio farmacéutico </w:t>
+      </w:r>
+      <w:r>
+        <w:rPr>
+          <w:b/>
+        </w:rPr>
+        <w:t>120</w:t>
+      </w:r>
+      <w:r>
+        <w:t xml:space="preserve"> — misma fila PRESUPUESTO/MODELO; no sumar 130+200 aparte del asesor).</w:t>
       </w:r>
     </w:p>
     <w:p>
@@ -2656,7 +3350,7 @@
               <w:rPr>
                 <w:sz w:val="20"/>
               </w:rPr>
-              <w:t>1–3</w:t>
+              <w:t>1-3</w:t>
             </w:r>
           </w:p>
         </w:tc>
@@ -2669,7 +3363,7 @@
               <w:rPr>
                 <w:sz w:val="20"/>
               </w:rPr>
-              <w:t>**Fase 0:** constitución, equipo, HQ, verificación SMS; onboarding farmacias — **Day-D = T+90**</w:t>
+              <w:t>**Fase 0:** constitución, equipo, HQ (**San Diego / Av. Bolívar Norte**), stack en **VPS Nameshared**, OTP **Firebase**; onboarding farmacias piloto — **Day-D = T+90** (ver [PLAN_LANZAMIENTO_COMERCIAL.md](PLAN_LANZAMIENTO_COMERCIAL.md)).</w:t>
             </w:r>
           </w:p>
         </w:tc>
@@ -2684,7 +3378,7 @@
               <w:rPr>
                 <w:sz w:val="20"/>
               </w:rPr>
-              <w:t>4–6</w:t>
+              <w:t>4-6</w:t>
             </w:r>
           </w:p>
         </w:tc>
@@ -2697,7 +3391,7 @@
               <w:rPr>
                 <w:sz w:val="20"/>
               </w:rPr>
-              <w:t>**M1–M3 post-Day-D:** rampa a **~62 activas**; revenue &gt; **USD 3.100**/mes hacia M3</w:t>
+              <w:t>**M1–M3 post-Day-D:** rampa a **~62 activas**; revenue M3 **USD 11.656** (MODELO S3.1 esc.1).</w:t>
             </w:r>
           </w:p>
         </w:tc>
@@ -2712,7 +3406,7 @@
               <w:rPr>
                 <w:sz w:val="20"/>
               </w:rPr>
-              <w:t>7–9</w:t>
+              <w:t>7-9</w:t>
             </w:r>
           </w:p>
         </w:tc>
@@ -2725,7 +3419,7 @@
               <w:rPr>
                 <w:sz w:val="20"/>
               </w:rPr>
-              <w:t>**~108–130 activas**; validación de receta en producción; revenue **~USD 5.400–6.500**/mes</w:t>
+              <w:t>**~108–130 activas**; validación Rx en producción _(objetivo operativo)_; revenue **~USD 20.304–24.440**/mes (M7–M9 esc.1).</w:t>
             </w:r>
           </w:p>
         </w:tc>
@@ -2740,7 +3434,7 @@
               <w:rPr>
                 <w:sz w:val="20"/>
               </w:rPr>
-              <w:t>10–12</w:t>
+              <w:t>10-12</w:t>
             </w:r>
           </w:p>
         </w:tc>
@@ -2753,18 +3447,13 @@
               <w:rPr>
                 <w:sz w:val="20"/>
               </w:rPr>
-              <w:t>**~141–159 activas**; **casi equilibrio M12**; cash **~USD 40.831**</w:t>
+              <w:t>**~141–159 activas** _(curva ref.)_; **cash M12 246.231** (esc.1: 187.152 + FCF +59.079); revenue ref. **~USD 29.892** (esc.1 — pricing 45/60/70 + % GMV).</w:t>
             </w:r>
           </w:p>
         </w:tc>
       </w:tr>
     </w:tbl>
     <w:p/>
-    <w:p>
-      <w:r>
-        <w:t>────────────────────────────────────────</w:t>
-      </w:r>
-    </w:p>
     <w:p>
       <w:pPr>
         <w:pStyle w:val="Heading1"/>
@@ -2840,7 +3529,7 @@
               <w:rPr>
                 <w:sz w:val="20"/>
               </w:rPr>
-              <w:t>Buffer **20%** + plan contingencia si devaluación &gt; 100% trimestral</w:t>
+              <w:t>**BCV mayo 2026:** proyección de **desaceleración** (inflación mensual de **un dígito desde mayo**). Escenarios externos pesimistas citan **387-618%** anual — el pack usa buffer **20%** (ponderado: 30% costos en bolívares, 10% en USD) + plan contingencia si devaluación &gt; 100% trimestral.</w:t>
             </w:r>
           </w:p>
         </w:tc>
@@ -2855,7 +3544,7 @@
               <w:rPr>
                 <w:sz w:val="20"/>
               </w:rPr>
-              <w:t>Regulación farmacéutica</w:t>
+              <w:t>Regulación farmacéutica venezolana</w:t>
             </w:r>
           </w:p>
         </w:tc>
@@ -2868,7 +3557,7 @@
               <w:rPr>
                 <w:sz w:val="20"/>
               </w:rPr>
-              <w:t>Farmacéutico colegiado por farmacia; dictamen abogado + asesor pre-Day-D</w:t>
+              <w:t>Cada farmacia afiliada aporta su propio farmacéutico colegiado. Dictamen **abogado + farmacéutico asesor** antes de Day-D. Asesor on-demand incluido en burn Lean (rubro Contador+Abogado 330).</w:t>
             </w:r>
           </w:p>
         </w:tc>
@@ -2883,7 +3572,7 @@
               <w:rPr>
                 <w:sz w:val="20"/>
               </w:rPr>
-              <w:t>Competencia Farmatodo / Locatel</w:t>
+              <w:t>Publicidad y claims en salud</w:t>
             </w:r>
           </w:p>
         </w:tc>
@@ -2896,7 +3585,7 @@
               <w:rPr>
                 <w:sz w:val="20"/>
               </w:rPr>
-              <w:t>Target distinto: independientes sin app propia</w:t>
+              <w:t>Checklist **Do/Don't** y aprobación creativos: [SUPUESTO_MARKETING_OFFLINE.md](SUPUESTO_MARKETING_OFFLINE.md) §1.1; avisos al paciente en [PROPUESTA_VALOR_USUARIO_FINAL.md](PROPUESTA_VALOR_USUARIO_FINAL.md) §2.1.</w:t>
             </w:r>
           </w:p>
         </w:tc>
@@ -2911,7 +3600,7 @@
               <w:rPr>
                 <w:sz w:val="20"/>
               </w:rPr>
-              <w:t>Adopción lenta del paciente</w:t>
+              <w:t>Competencia de Farmatodo / Locatel</w:t>
             </w:r>
           </w:p>
         </w:tc>
@@ -2924,7 +3613,7 @@
               <w:rPr>
                 <w:sz w:val="20"/>
               </w:rPr>
-              <w:t>**Liquidez B2B primero:** catálogo + ~28 activas pre-Day-D</w:t>
+              <w:t>No competimos en su segmento (cadenas premium); competimos en farmacias medianas e independientes que **no** tienen **app / marketplace** propio integrado.</w:t>
             </w:r>
           </w:p>
         </w:tc>
@@ -2939,7 +3628,7 @@
               <w:rPr>
                 <w:sz w:val="20"/>
               </w:rPr>
-              <w:t>Pagos manuales VE</w:t>
+              <w:t>Adopción inicial lenta del paciente</w:t>
             </w:r>
           </w:p>
         </w:tc>
@@ -2952,7 +3641,7 @@
               <w:rPr>
                 <w:sz w:val="20"/>
               </w:rPr>
-              <w:t>Implementados en código; verificación SMS paciente en Fase 0</w:t>
+              <w:t>**Liquidez B2B primero** (§2.10 CONTEXTO): catálogo + **~28 activas** pre-Day-D; demanda vía referidos farmacia + Meta geo; no tráfico masivo sin oferta.</w:t>
             </w:r>
           </w:p>
         </w:tc>
@@ -2967,7 +3656,7 @@
               <w:rPr>
                 <w:sz w:val="20"/>
               </w:rPr>
-              <w:t>Curva comercial optimista</w:t>
+              <w:t>Pagos manuales VE complejos</w:t>
             </w:r>
           </w:p>
         </w:tc>
@@ -2980,7 +3669,7 @@
               <w:rPr>
                 <w:sz w:val="20"/>
               </w:rPr>
-              <w:t>Ajustar metas si discovery en calle muestra cierre &lt;3 firmas/mes/vendedor</w:t>
+              <w:t>Implementados en código (**staging/VPS**); OTP paciente vía **Firebase Phone Auth** (SMS) en hito T+7–12 Fase 0. Factura digital SENIAT cuando la empresa esté constituida y el trámite esté habilitado.</w:t>
             </w:r>
           </w:p>
         </w:tc>
@@ -2988,8 +3677,125 @@
     </w:tbl>
     <w:p/>
     <w:p>
-      <w:r>
-        <w:t>────────────────────────────────────────</w:t>
+      <w:pPr>
+        <w:pStyle w:val="Heading1"/>
+      </w:pPr>
+      <w:r>
+        <w:t>Pregunta al inversor</w:t>
+      </w:r>
+    </w:p>
+    <w:p>
+      <w:r>
+        <w:rPr>
+          <w:i/>
+        </w:rPr>
+        <w:t>¿Te sumas a **USD 237.412** (Lean v4 Excel — equipo tabla burn: CEO+Founder+Co-CEO+Dev+4×Sales+CS) vía SAFE cap **600.000** _(equity ~39,57%)_, para **Fase 0 (50.260) + 12 meses** post-Day-D (burn **172.152**)? Cash M12: **246.231** (esc.1: 187.152 + FCF +59.079) — ver BRIEF § modelo y [`MODELO_FINANCIERO_ZONIX_PHARMA.xlsx`](MODELO_FINANCIERO_ZONIX_PHARMA.xlsx).</w:t>
+      </w:r>
+    </w:p>
+    <w:p>
+      <w:r/>
+      <w:r>
+        <w:rPr>
+          <w:b/>
+        </w:rPr>
+        <w:t>Por qué ahora (sin urgencia falsa):</w:t>
+      </w:r>
+      <w:r>
+        <w:t xml:space="preserve"> mercado pharma VE </w:t>
+      </w:r>
+      <w:r>
+        <w:rPr>
+          <w:b/>
+        </w:rPr>
+        <w:t>+17,49%</w:t>
+      </w:r>
+      <w:r>
+        <w:t xml:space="preserve"> unidades (Cifar); stack </w:t>
+      </w:r>
+      <w:r>
+        <w:rPr>
+          <w:b/>
+        </w:rPr>
+        <w:t>~4 años</w:t>
+      </w:r>
+      <w:r>
+        <w:t xml:space="preserve"> ya en staging; ventana </w:t>
+      </w:r>
+      <w:r>
+        <w:rPr>
+          <w:b/>
+        </w:rPr>
+        <w:t>early mover</w:t>
+      </w:r>
+      <w:r>
+        <w:t xml:space="preserve"> en independientes Valencia 2026 — el pack detalla supuestos y sensibilidad antes de comprometer capital.</w:t>
+      </w:r>
+    </w:p>
+    <w:p>
+      <w:pPr>
+        <w:pStyle w:val="Heading2"/>
+      </w:pPr>
+      <w:r>
+        <w:t>Pre-requisitos DD (founder — antes de reunión institucional)</w:t>
+      </w:r>
+    </w:p>
+    <w:p>
+      <w:r>
+        <w:t xml:space="preserve">Checklist </w:t>
+      </w:r>
+      <w:r>
+        <w:rPr>
+          <w:b/>
+        </w:rPr>
+        <w:t>P0</w:t>
+      </w:r>
+      <w:r>
+        <w:t xml:space="preserve"> en [REGISTRO_PENDIENTES_PACK.md](REGISTRO_PENDIENTES_PACK.md): URL </w:t>
+      </w:r>
+      <w:r>
+        <w:rPr>
+          <w:b/>
+        </w:rPr>
+        <w:t>GitHub</w:t>
+      </w:r>
+      <w:r>
+        <w:t xml:space="preserve"> o acceso repo bajo NDA; </w:t>
+      </w:r>
+      <w:r>
+        <w:rPr>
+          <w:b/>
+        </w:rPr>
+        <w:t>% dedicación</w:t>
+      </w:r>
+      <w:r>
+        <w:t xml:space="preserve"> Zonix Pharma vs otros compromisos; </w:t>
+      </w:r>
+      <w:r>
+        <w:rPr>
+          <w:b/>
+        </w:rPr>
+        <w:t>2–3 referencias</w:t>
+      </w:r>
+      <w:r>
+        <w:t xml:space="preserve"> verificables; re-ejecutar </w:t>
+      </w:r>
+      <w:r>
+        <w:rPr>
+          <w:b/>
+        </w:rPr>
+        <w:t>443 tests</w:t>
+      </w:r>
+      <w:r>
+        <w:t xml:space="preserve"> y actualizar [VOLCADO_RESPUESTAS_CUESTIONARIO.md](VOLCADO_RESPUESTAS_CUESTIONARIO.md) §1.2; </w:t>
+      </w:r>
+      <w:r>
+        <w:rPr>
+          <w:b/>
+        </w:rPr>
+        <w:t>NDA</w:t>
+      </w:r>
+      <w:r>
+        <w:t xml:space="preserve"> / data room si el inversor lo exige.</w:t>
       </w:r>
     </w:p>
     <w:p>
@@ -2997,173 +3803,48 @@
         <w:pStyle w:val="Heading1"/>
       </w:pPr>
       <w:r>
-        <w:t>Qué nos gustaría que revises, Gabriel</w:t>
+        <w:t>Llamada a la acción</w:t>
       </w:r>
     </w:p>
     <w:p>
-      <w:r>
-        <w:t xml:space="preserve">1. </w:t>
-      </w:r>
+      <w:r/>
       <w:r>
         <w:rPr>
           <w:b/>
         </w:rPr>
-        <w:t>¿El brief refleja la realidad comercial de Valencia?</w:t>
-      </w:r>
-      <w:r>
-        <w:t xml:space="preserve"> — ¿Falta algún actor local (droguería, cadena regional, distribuidor) que debamos considerar en el mapa competitivo?</w:t>
-      </w:r>
-    </w:p>
-    <w:p>
-      <w:r>
-        <w:t xml:space="preserve">2. </w:t>
+        <w:t>Siguiente paso concreto:</w:t>
+      </w:r>
+      <w:r>
+        <w:t xml:space="preserve"> reunión de </w:t>
       </w:r>
       <w:r>
         <w:rPr>
           <w:b/>
         </w:rPr>
-        <w:t>¿La curva ~159 activas M12 es creíble</w:t>
-      </w:r>
-      <w:r>
-        <w:t xml:space="preserve"> con 4 vendedores de campo, o es optimista/pesimista según tu experiencia en prospección B2B en Carabobo?</w:t>
+        <w:t>30 min</w:t>
+      </w:r>
+      <w:r>
+        <w:t xml:space="preserve"> con guion en [CHECKLIST_PRE_INVERSOR.md](CHECKLIST_PRE_INVERSOR.md). Si prefieres revisar antes:</w:t>
       </w:r>
     </w:p>
     <w:p>
       <w:r>
-        <w:t xml:space="preserve">3. </w:t>
-      </w:r>
-      <w:r>
-        <w:rPr>
-          <w:b/>
-        </w:rPr>
-        <w:t>¿El timing “2026 es la ventana” tiene sentido</w:t>
-      </w:r>
-      <w:r>
-        <w:t xml:space="preserve"> desde tu perspectiva de consultoría — o el mercado pharma local aún no está listo para marketplace digital?</w:t>
+        <w:t>1. [BRIEF_UNA_PAGINA.md](BRIEF_UNA_PAGINA.md) + [PROYECCION_FINANCIERA_12M.md](PROYECCION_FINANCIERA_12M.md) §1.1 — números y tesis.</w:t>
       </w:r>
     </w:p>
     <w:p>
       <w:r>
-        <w:t xml:space="preserve">4. </w:t>
-      </w:r>
-      <w:r>
-        <w:rPr>
-          <w:b/>
-        </w:rPr>
-        <w:t>¿Qué ajustarías en el mensaje a la farmacia</w:t>
-      </w:r>
-      <w:r>
-        <w:t xml:space="preserve"> (cuota + % vs. agregador) para que resuene con dueños de farmacia independiente en Valencia?</w:t>
+        <w:t>2. [MENSAJE_ENVIO_Y_BULLETS_INVERSIONISTA.md](MENSAJE_ENVIO_Y_BULLETS_INVERSIONISTA.md) — texto listo para compartir.</w:t>
       </w:r>
     </w:p>
     <w:p>
       <w:r>
-        <w:t xml:space="preserve">5. </w:t>
-      </w:r>
-      <w:r>
-        <w:rPr>
-          <w:b/>
-        </w:rPr>
-        <w:t>¿Las escenas de paciente (Naguanagua) y farmacia (El Socorro) suenan verosímiles</w:t>
-      </w:r>
-      <w:r>
-        <w:t xml:space="preserve"> o cambiarías el corredor geográfico del ejemplo?</w:t>
+        <w:t>3. [ALINEACION_LANZAMIENTO_VS_PRODUCTO_2026-05.md](ALINEACION_LANZAMIENTO_VS_PRODUCTO_2026-05.md) — pack ↔ producto (opcional DD técnico).</w:t>
       </w:r>
     </w:p>
     <w:p>
       <w:r>
-        <w:t>────────────────────────────────────────</w:t>
-      </w:r>
-    </w:p>
-    <w:p>
-      <w:pPr>
-        <w:pStyle w:val="Heading1"/>
-      </w:pPr>
-      <w:r>
-        <w:t>Disclaimers</w:t>
-      </w:r>
-    </w:p>
-    <w:p>
-      <w:r>
-        <w:t xml:space="preserve">- </w:t>
-      </w:r>
-      <w:r>
-        <w:rPr>
-          <w:b/>
-        </w:rPr>
-        <w:t>Pre-seed / sin revenue:</w:t>
-      </w:r>
-      <w:r>
-        <w:t xml:space="preserve"> cifras con supuestos documentados; </w:t>
-      </w:r>
-      <w:r>
-        <w:rPr>
-          <w:b/>
-        </w:rPr>
-        <w:t>ingreso medio ~USD 50/mes</w:t>
-      </w:r>
-      <w:r>
-        <w:t xml:space="preserve"> es placeholder hasta ventas piloto reales.</w:t>
-      </w:r>
-    </w:p>
-    <w:p>
-      <w:r>
-        <w:t xml:space="preserve">- </w:t>
-      </w:r>
-      <w:r>
-        <w:rPr>
-          <w:b/>
-        </w:rPr>
-        <w:t>Regulatorio:</w:t>
-      </w:r>
-      <w:r>
-        <w:t xml:space="preserve"> Zonix no sustituye al farmacéutico titular ni al criterio médico; dictamen legal pendiente antes de Day-D público.</w:t>
-      </w:r>
-    </w:p>
-    <w:p>
-      <w:r>
-        <w:t xml:space="preserve">- </w:t>
-      </w:r>
-      <w:r>
-        <w:rPr>
-          <w:b/>
-        </w:rPr>
-        <w:t>Inflación VE:</w:t>
-      </w:r>
-      <w:r>
-        <w:t xml:space="preserve"> cifras </w:t>
-      </w:r>
-      <w:r>
-        <w:rPr>
-          <w:b/>
-        </w:rPr>
-        <w:t>mayo–junio 2026</w:t>
-      </w:r>
-      <w:r>
-        <w:t>; escenarios externos citan inflación anual alta — el plan incluye buffer 20% y contingencia.</w:t>
-      </w:r>
-    </w:p>
-    <w:p>
-      <w:r>
-        <w:t xml:space="preserve">- </w:t>
-      </w:r>
-      <w:r>
-        <w:rPr>
-          <w:b/>
-        </w:rPr>
-        <w:t>Capital e instrumento SAFE:</w:t>
-      </w:r>
-      <w:r>
-        <w:t xml:space="preserve"> incluidos solo como contexto de viabilidad; </w:t>
-      </w:r>
-      <w:r>
-        <w:rPr>
-          <w:b/>
-        </w:rPr>
-        <w:t>no constituyen solicitud de inversión a Gabriel Barrios</w:t>
-      </w:r>
-      <w:r>
-        <w:t xml:space="preserve"> salvo acuerdo explícito posterior.</w:t>
+        <w:t>Marco regulatorio VE: [`../PLAN_REGULATORIO_PHARMA_VE.md`](../PLAN_REGULATORIO_PHARMA_VE.md), pagos [PLAN_METODOS_PAGO.md](PLAN_METODOS_PAGO.md) §10. Identidad de marca: [`../BRAND_ZONIX_PHARMA.md`](../BRAND_ZONIX_PHARMA.md).</w:t>
       </w:r>
     </w:p>
     <w:sectPr>

</xml_diff>